<commit_message>
Added sources to my report
</commit_message>
<xml_diff>
--- a/porocila/DavidGucek.docx
+++ b/porocila/DavidGucek.docx
@@ -183,7 +183,6 @@
               <w:noProof/>
               <w:sz w:val="24"/>
               <w:szCs w:val="24"/>
-              <w:lang/>
             </w:rPr>
           </w:pPr>
           <w:r>
@@ -209,7 +208,6 @@
                 <w:noProof/>
                 <w:sz w:val="24"/>
                 <w:szCs w:val="24"/>
-                <w:lang/>
               </w:rPr>
               <w:tab/>
             </w:r>
@@ -278,7 +276,6 @@
               <w:noProof/>
               <w:sz w:val="24"/>
               <w:szCs w:val="24"/>
-              <w:lang/>
             </w:rPr>
           </w:pPr>
           <w:hyperlink w:anchor="_Toc243909914" w:history="1">
@@ -295,7 +292,6 @@
                 <w:noProof/>
                 <w:sz w:val="24"/>
                 <w:szCs w:val="24"/>
-                <w:lang/>
               </w:rPr>
               <w:tab/>
             </w:r>
@@ -304,15 +300,7 @@
                 <w:rStyle w:val="Hyperlink"/>
                 <w:noProof/>
               </w:rPr>
-              <w:t>Poro</w:t>
-            </w:r>
-            <w:r>
-              <w:rPr>
-                <w:rStyle w:val="Hyperlink"/>
-                <w:noProof/>
-                <w:lang/>
-              </w:rPr>
-              <w:t>čilo za drugi teden</w:t>
+              <w:t>Poročilo za drugi teden</w:t>
             </w:r>
             <w:r>
               <w:rPr>
@@ -1597,1360 +1585,1636 @@
     </w:p>
     <w:p>
       <w:pPr>
-        <w:pStyle w:val="Heading1"/>
-      </w:pPr>
-      <w:bookmarkStart w:id="3" w:name="_Toc243909914"/>
-      <w:r>
-        <w:t>Poro</w:t>
-      </w:r>
-      <w:r>
-        <w:rPr>
-          <w:lang/>
-        </w:rPr>
-        <w:t>čilo za drugi teden</w:t>
-      </w:r>
-      <w:bookmarkEnd w:id="3"/>
+        <w:rPr>
+          <w:b/>
+          <w:bCs/>
+          <w:lang w:val="sl-SI"/>
+        </w:rPr>
+      </w:pPr>
+      <w:r>
+        <w:rPr>
+          <w:b/>
+          <w:bCs/>
+          <w:lang w:val="sl-SI"/>
+        </w:rPr>
+        <w:t>Viri</w:t>
+      </w:r>
     </w:p>
     <w:p>
-      <w:proofErr w:type="spellStart"/>
-      <w:r>
-        <w:t>Vse</w:t>
-      </w:r>
-      <w:proofErr w:type="spellEnd"/>
-      <w:r>
-        <w:t xml:space="preserve"> </w:t>
-      </w:r>
-      <w:proofErr w:type="spellStart"/>
-      <w:r>
-        <w:t>skupaj</w:t>
-      </w:r>
-      <w:proofErr w:type="spellEnd"/>
-      <w:r>
-        <w:t xml:space="preserve"> </w:t>
-      </w:r>
-      <w:proofErr w:type="spellStart"/>
-      <w:r>
-        <w:t>sem</w:t>
-      </w:r>
-      <w:proofErr w:type="spellEnd"/>
-      <w:r>
-        <w:t xml:space="preserve"> </w:t>
-      </w:r>
-      <w:proofErr w:type="spellStart"/>
-      <w:r>
-        <w:t>porabil</w:t>
-      </w:r>
-      <w:proofErr w:type="spellEnd"/>
-      <w:r>
-        <w:t xml:space="preserve"> </w:t>
-      </w:r>
-      <w:proofErr w:type="spellStart"/>
-      <w:r>
-        <w:t>približno</w:t>
-      </w:r>
-      <w:proofErr w:type="spellEnd"/>
-      <w:r>
-        <w:t xml:space="preserve"> 4 </w:t>
-      </w:r>
-      <w:proofErr w:type="spellStart"/>
-      <w:r>
-        <w:t>ure</w:t>
-      </w:r>
-      <w:proofErr w:type="spellEnd"/>
-      <w:r>
-        <w:t>.</w:t>
+      <w:pPr>
+        <w:rPr>
+          <w:lang w:val="sl-SI"/>
+        </w:rPr>
+      </w:pPr>
+      <w:r>
+        <w:rPr>
+          <w:lang w:val="sl-SI"/>
+        </w:rPr>
+        <w:t>i-Učbeniki:</w:t>
       </w:r>
     </w:p>
     <w:p>
-      <w:r>
-        <w:t xml:space="preserve">V </w:t>
-      </w:r>
-      <w:proofErr w:type="spellStart"/>
-      <w:r>
-        <w:t>datoteki</w:t>
-      </w:r>
-      <w:proofErr w:type="spellEnd"/>
-      <w:r>
-        <w:t xml:space="preserve"> </w:t>
-      </w:r>
-      <w:proofErr w:type="spellStart"/>
-      <w:proofErr w:type="gramStart"/>
-      <w:r>
-        <w:t>question.generators</w:t>
-      </w:r>
-      <w:proofErr w:type="gramEnd"/>
-      <w:r>
-        <w:t>.ts</w:t>
-      </w:r>
-      <w:proofErr w:type="spellEnd"/>
-      <w:r>
-        <w:t xml:space="preserve"> </w:t>
-      </w:r>
-      <w:proofErr w:type="spellStart"/>
-      <w:r>
-        <w:t>sem</w:t>
-      </w:r>
-      <w:proofErr w:type="spellEnd"/>
-      <w:r>
-        <w:t xml:space="preserve"> </w:t>
-      </w:r>
-      <w:proofErr w:type="spellStart"/>
-      <w:r>
-        <w:t>implementiral</w:t>
-      </w:r>
-      <w:proofErr w:type="spellEnd"/>
-      <w:r>
-        <w:t xml:space="preserve"> </w:t>
-      </w:r>
-      <w:proofErr w:type="spellStart"/>
-      <w:r>
-        <w:t>sistem</w:t>
-      </w:r>
-      <w:proofErr w:type="spellEnd"/>
-      <w:r>
-        <w:t xml:space="preserve"> za </w:t>
-      </w:r>
-      <w:proofErr w:type="spellStart"/>
-      <w:r>
-        <w:t>samodejno</w:t>
-      </w:r>
-      <w:proofErr w:type="spellEnd"/>
-      <w:r>
-        <w:t xml:space="preserve"> </w:t>
-      </w:r>
-      <w:proofErr w:type="spellStart"/>
-      <w:r>
-        <w:t>generiranje</w:t>
-      </w:r>
-      <w:proofErr w:type="spellEnd"/>
-      <w:r>
-        <w:t xml:space="preserve"> </w:t>
-      </w:r>
-      <w:proofErr w:type="spellStart"/>
-      <w:r>
-        <w:t>matematičnih</w:t>
-      </w:r>
-      <w:proofErr w:type="spellEnd"/>
-      <w:r>
-        <w:t xml:space="preserve"> </w:t>
-      </w:r>
-      <w:proofErr w:type="spellStart"/>
-      <w:r>
-        <w:t>vprašanj</w:t>
-      </w:r>
-      <w:proofErr w:type="spellEnd"/>
-      <w:r>
-        <w:t xml:space="preserve">. Poleg </w:t>
-      </w:r>
-      <w:proofErr w:type="spellStart"/>
-      <w:r>
-        <w:t>seštevanja</w:t>
-      </w:r>
-      <w:proofErr w:type="spellEnd"/>
-      <w:r>
-        <w:t xml:space="preserve">, </w:t>
-      </w:r>
-      <w:proofErr w:type="spellStart"/>
-      <w:r>
-        <w:t>odštevanja</w:t>
-      </w:r>
-      <w:proofErr w:type="spellEnd"/>
-      <w:r>
-        <w:t xml:space="preserve"> in </w:t>
-      </w:r>
-      <w:proofErr w:type="spellStart"/>
-      <w:r>
-        <w:t>množenja</w:t>
-      </w:r>
-      <w:proofErr w:type="spellEnd"/>
-      <w:r>
-        <w:t xml:space="preserve"> </w:t>
-      </w:r>
-      <w:proofErr w:type="spellStart"/>
-      <w:r>
-        <w:t>sem</w:t>
-      </w:r>
-      <w:proofErr w:type="spellEnd"/>
-      <w:r>
-        <w:t xml:space="preserve"> </w:t>
-      </w:r>
-      <w:proofErr w:type="spellStart"/>
-      <w:r>
-        <w:t>dodal</w:t>
-      </w:r>
-      <w:proofErr w:type="spellEnd"/>
-      <w:r>
-        <w:t xml:space="preserve"> </w:t>
-      </w:r>
-      <w:proofErr w:type="spellStart"/>
-      <w:r>
-        <w:t>generatorje</w:t>
-      </w:r>
-      <w:proofErr w:type="spellEnd"/>
-      <w:r>
-        <w:t xml:space="preserve"> za </w:t>
-      </w:r>
-      <w:proofErr w:type="spellStart"/>
-      <w:r>
-        <w:t>vsa</w:t>
-      </w:r>
-      <w:proofErr w:type="spellEnd"/>
-      <w:r>
-        <w:t xml:space="preserve"> </w:t>
-      </w:r>
-      <w:proofErr w:type="spellStart"/>
-      <w:r>
-        <w:t>področja</w:t>
-      </w:r>
-      <w:proofErr w:type="spellEnd"/>
-      <w:r>
-        <w:t xml:space="preserve"> </w:t>
-      </w:r>
-      <w:proofErr w:type="spellStart"/>
-      <w:r>
-        <w:t>matematike</w:t>
-      </w:r>
-      <w:proofErr w:type="spellEnd"/>
-      <w:r>
-        <w:t xml:space="preserve"> v 3., 6. in 9. </w:t>
-      </w:r>
-      <w:proofErr w:type="spellStart"/>
-      <w:r>
-        <w:t>razredu</w:t>
-      </w:r>
-      <w:proofErr w:type="spellEnd"/>
-      <w:r>
-        <w:t xml:space="preserve"> </w:t>
-      </w:r>
-      <w:proofErr w:type="spellStart"/>
-      <w:r>
-        <w:t>osnovne</w:t>
-      </w:r>
-      <w:proofErr w:type="spellEnd"/>
-      <w:r>
-        <w:t xml:space="preserve"> </w:t>
-      </w:r>
-      <w:proofErr w:type="spellStart"/>
-      <w:r>
-        <w:t>šole</w:t>
-      </w:r>
-      <w:proofErr w:type="spellEnd"/>
-      <w:r>
-        <w:t xml:space="preserve">, ki </w:t>
-      </w:r>
-      <w:proofErr w:type="spellStart"/>
-      <w:r>
-        <w:t>sem</w:t>
-      </w:r>
-      <w:proofErr w:type="spellEnd"/>
-      <w:r>
-        <w:t xml:space="preserve"> </w:t>
-      </w:r>
-      <w:proofErr w:type="spellStart"/>
-      <w:r>
-        <w:t>jih</w:t>
-      </w:r>
-      <w:proofErr w:type="spellEnd"/>
-      <w:r>
-        <w:t xml:space="preserve"> </w:t>
-      </w:r>
-      <w:proofErr w:type="spellStart"/>
-      <w:r>
-        <w:t>določil</w:t>
-      </w:r>
-      <w:proofErr w:type="spellEnd"/>
-      <w:r>
-        <w:t xml:space="preserve"> v </w:t>
-      </w:r>
-      <w:proofErr w:type="spellStart"/>
-      <w:r>
-        <w:t>prejšnjem</w:t>
-      </w:r>
-      <w:proofErr w:type="spellEnd"/>
-      <w:r>
-        <w:t xml:space="preserve"> </w:t>
-      </w:r>
-      <w:proofErr w:type="spellStart"/>
-      <w:r>
-        <w:t>poročilu</w:t>
-      </w:r>
-      <w:proofErr w:type="spellEnd"/>
-      <w:r>
-        <w:t>.</w:t>
-      </w:r>
+      <w:pPr>
+        <w:rPr>
+          <w:lang w:val="sl-SI"/>
+        </w:rPr>
+      </w:pPr>
+      <w:hyperlink r:id="rId6" w:history="1">
+        <w:r>
+          <w:rPr>
+            <w:rStyle w:val="Hyperlink"/>
+            <w:lang w:val="sl-SI"/>
+          </w:rPr>
+          <w:t>https://eucbeniki.sio.si/</w:t>
+        </w:r>
+      </w:hyperlink>
     </w:p>
     <w:p>
-      <w:r>
-        <w:t xml:space="preserve">Za 3. </w:t>
-      </w:r>
-      <w:proofErr w:type="spellStart"/>
-      <w:r>
-        <w:t>razred</w:t>
-      </w:r>
-      <w:proofErr w:type="spellEnd"/>
-      <w:r>
-        <w:t xml:space="preserve"> </w:t>
-      </w:r>
-      <w:proofErr w:type="spellStart"/>
-      <w:r>
-        <w:t>sem</w:t>
-      </w:r>
-      <w:proofErr w:type="spellEnd"/>
-      <w:r>
-        <w:t xml:space="preserve"> </w:t>
-      </w:r>
-      <w:proofErr w:type="spellStart"/>
-      <w:r>
-        <w:t>implementiral</w:t>
-      </w:r>
-      <w:proofErr w:type="spellEnd"/>
-      <w:r>
-        <w:t xml:space="preserve"> </w:t>
-      </w:r>
-      <w:proofErr w:type="spellStart"/>
-      <w:r>
-        <w:t>množenje</w:t>
-      </w:r>
-      <w:proofErr w:type="spellEnd"/>
-      <w:r>
-        <w:t xml:space="preserve">, </w:t>
-      </w:r>
-      <w:proofErr w:type="spellStart"/>
-      <w:r>
-        <w:t>deljenje</w:t>
-      </w:r>
-      <w:proofErr w:type="spellEnd"/>
-      <w:r>
-        <w:t xml:space="preserve"> </w:t>
-      </w:r>
-      <w:proofErr w:type="spellStart"/>
-      <w:r>
-        <w:t>brez</w:t>
-      </w:r>
-      <w:proofErr w:type="spellEnd"/>
-      <w:r>
-        <w:t xml:space="preserve"> </w:t>
-      </w:r>
-      <w:proofErr w:type="spellStart"/>
-      <w:r>
-        <w:t>ostanka</w:t>
-      </w:r>
-      <w:proofErr w:type="spellEnd"/>
-      <w:r>
-        <w:t xml:space="preserve">, </w:t>
-      </w:r>
-      <w:proofErr w:type="spellStart"/>
-      <w:r>
-        <w:t>seštevanje</w:t>
-      </w:r>
-      <w:proofErr w:type="spellEnd"/>
-      <w:r>
-        <w:t xml:space="preserve"> in </w:t>
-      </w:r>
-      <w:proofErr w:type="spellStart"/>
-      <w:r>
-        <w:t>odštevanje</w:t>
-      </w:r>
-      <w:proofErr w:type="spellEnd"/>
-      <w:r>
-        <w:t xml:space="preserve">, </w:t>
-      </w:r>
-      <w:proofErr w:type="spellStart"/>
-      <w:r>
-        <w:t>dopolnjevanje</w:t>
-      </w:r>
-      <w:proofErr w:type="spellEnd"/>
-      <w:r>
-        <w:t xml:space="preserve"> </w:t>
-      </w:r>
-      <w:proofErr w:type="spellStart"/>
-      <w:r>
-        <w:t>računov</w:t>
-      </w:r>
-      <w:proofErr w:type="spellEnd"/>
-      <w:r>
-        <w:t xml:space="preserve"> ter </w:t>
-      </w:r>
-      <w:proofErr w:type="spellStart"/>
-      <w:r>
-        <w:t>čas</w:t>
-      </w:r>
-      <w:proofErr w:type="spellEnd"/>
-      <w:r>
-        <w:t xml:space="preserve"> in </w:t>
-      </w:r>
-      <w:proofErr w:type="spellStart"/>
-      <w:r>
-        <w:t>merske</w:t>
-      </w:r>
-      <w:proofErr w:type="spellEnd"/>
-      <w:r>
-        <w:t xml:space="preserve"> </w:t>
-      </w:r>
-      <w:proofErr w:type="spellStart"/>
-      <w:r>
-        <w:t>enote</w:t>
-      </w:r>
-      <w:proofErr w:type="spellEnd"/>
-      <w:r>
-        <w:t xml:space="preserve">. Za 6. </w:t>
-      </w:r>
-      <w:proofErr w:type="spellStart"/>
-      <w:r>
-        <w:t>razred</w:t>
-      </w:r>
-      <w:proofErr w:type="spellEnd"/>
-      <w:r>
-        <w:t xml:space="preserve"> </w:t>
-      </w:r>
-      <w:proofErr w:type="spellStart"/>
-      <w:r>
-        <w:t>deljenje</w:t>
-      </w:r>
-      <w:proofErr w:type="spellEnd"/>
-      <w:r>
-        <w:t xml:space="preserve"> </w:t>
-      </w:r>
-      <w:proofErr w:type="spellStart"/>
-      <w:r>
-        <w:t>naravnih</w:t>
-      </w:r>
-      <w:proofErr w:type="spellEnd"/>
-      <w:r>
-        <w:t xml:space="preserve"> </w:t>
-      </w:r>
-      <w:proofErr w:type="spellStart"/>
-      <w:r>
-        <w:t>števil</w:t>
-      </w:r>
-      <w:proofErr w:type="spellEnd"/>
-      <w:r>
-        <w:t xml:space="preserve">, </w:t>
-      </w:r>
-      <w:proofErr w:type="spellStart"/>
-      <w:r>
-        <w:t>ulomki</w:t>
-      </w:r>
-      <w:proofErr w:type="spellEnd"/>
-      <w:r>
-        <w:t xml:space="preserve">, </w:t>
-      </w:r>
-      <w:proofErr w:type="spellStart"/>
-      <w:r>
-        <w:t>obseg</w:t>
-      </w:r>
-      <w:proofErr w:type="spellEnd"/>
-      <w:r>
-        <w:t xml:space="preserve"> in </w:t>
-      </w:r>
-      <w:proofErr w:type="spellStart"/>
-      <w:r>
-        <w:t>ploščina</w:t>
-      </w:r>
-      <w:proofErr w:type="spellEnd"/>
-      <w:r>
-        <w:t xml:space="preserve">, </w:t>
-      </w:r>
-      <w:proofErr w:type="spellStart"/>
-      <w:r>
-        <w:t>številski</w:t>
-      </w:r>
-      <w:proofErr w:type="spellEnd"/>
-      <w:r>
-        <w:t xml:space="preserve"> </w:t>
-      </w:r>
-      <w:proofErr w:type="spellStart"/>
-      <w:r>
-        <w:t>izrazi</w:t>
-      </w:r>
-      <w:proofErr w:type="spellEnd"/>
-      <w:r>
-        <w:t xml:space="preserve"> ter </w:t>
-      </w:r>
-      <w:proofErr w:type="spellStart"/>
-      <w:r>
-        <w:t>večkratniki</w:t>
-      </w:r>
-      <w:proofErr w:type="spellEnd"/>
-      <w:r>
-        <w:t xml:space="preserve"> in </w:t>
-      </w:r>
-      <w:proofErr w:type="spellStart"/>
-      <w:r>
-        <w:t>delitelji</w:t>
-      </w:r>
-      <w:proofErr w:type="spellEnd"/>
-      <w:r>
-        <w:t xml:space="preserve">. Za 9. </w:t>
-      </w:r>
-      <w:proofErr w:type="spellStart"/>
-      <w:r>
-        <w:t>razred</w:t>
-      </w:r>
-      <w:proofErr w:type="spellEnd"/>
-      <w:r>
-        <w:t xml:space="preserve"> pa </w:t>
-      </w:r>
-      <w:proofErr w:type="spellStart"/>
-      <w:r>
-        <w:t>odstotki</w:t>
-      </w:r>
-      <w:proofErr w:type="spellEnd"/>
-      <w:r>
-        <w:t xml:space="preserve">, </w:t>
-      </w:r>
-      <w:proofErr w:type="spellStart"/>
-      <w:r>
-        <w:t>linearne</w:t>
-      </w:r>
-      <w:proofErr w:type="spellEnd"/>
-      <w:r>
-        <w:t xml:space="preserve"> </w:t>
-      </w:r>
-      <w:proofErr w:type="spellStart"/>
-      <w:r>
-        <w:t>enačbe</w:t>
-      </w:r>
-      <w:proofErr w:type="spellEnd"/>
-      <w:r>
-        <w:t xml:space="preserve">, </w:t>
-      </w:r>
-      <w:proofErr w:type="spellStart"/>
-      <w:r>
-        <w:t>funkcije</w:t>
-      </w:r>
-      <w:proofErr w:type="spellEnd"/>
-      <w:r>
-        <w:t xml:space="preserve"> in </w:t>
-      </w:r>
-      <w:proofErr w:type="spellStart"/>
-      <w:r>
-        <w:t>grafi</w:t>
-      </w:r>
-      <w:proofErr w:type="spellEnd"/>
-      <w:r>
-        <w:t xml:space="preserve">, </w:t>
-      </w:r>
-      <w:proofErr w:type="spellStart"/>
-      <w:r>
-        <w:t>Pitagorov</w:t>
-      </w:r>
-      <w:proofErr w:type="spellEnd"/>
-      <w:r>
-        <w:t xml:space="preserve"> </w:t>
-      </w:r>
-      <w:proofErr w:type="spellStart"/>
-      <w:r>
-        <w:t>izrek</w:t>
-      </w:r>
-      <w:proofErr w:type="spellEnd"/>
-      <w:r>
-        <w:t xml:space="preserve"> ter potence in </w:t>
-      </w:r>
-      <w:proofErr w:type="spellStart"/>
-      <w:r>
-        <w:t>kvadratni</w:t>
-      </w:r>
-      <w:proofErr w:type="spellEnd"/>
-      <w:r>
-        <w:t xml:space="preserve"> </w:t>
-      </w:r>
-      <w:proofErr w:type="spellStart"/>
-      <w:r>
-        <w:t>koreni</w:t>
-      </w:r>
-      <w:proofErr w:type="spellEnd"/>
-      <w:r>
-        <w:t>.</w:t>
+      <w:pPr>
+        <w:rPr>
+          <w:lang w:val="sl-SI"/>
+        </w:rPr>
+      </w:pPr>
+      <w:r>
+        <w:rPr>
+          <w:lang w:val="sl-SI"/>
+        </w:rPr>
+        <w:t>Učni načrt za matematiko</w:t>
+      </w:r>
+      <w:r>
+        <w:rPr>
+          <w:lang w:val="sl-SI"/>
+        </w:rPr>
+        <w:t>:</w:t>
       </w:r>
     </w:p>
     <w:p>
-      <w:proofErr w:type="spellStart"/>
-      <w:r>
-        <w:t>Dodal</w:t>
-      </w:r>
-      <w:proofErr w:type="spellEnd"/>
-      <w:r>
-        <w:t xml:space="preserve"> </w:t>
-      </w:r>
-      <w:proofErr w:type="spellStart"/>
-      <w:r>
-        <w:t>sem</w:t>
-      </w:r>
-      <w:proofErr w:type="spellEnd"/>
-      <w:r>
-        <w:t xml:space="preserve"> </w:t>
-      </w:r>
-      <w:proofErr w:type="spellStart"/>
-      <w:r>
-        <w:t>lestvico</w:t>
-      </w:r>
-      <w:proofErr w:type="spellEnd"/>
-      <w:r>
-        <w:t xml:space="preserve"> </w:t>
-      </w:r>
-      <w:proofErr w:type="spellStart"/>
-      <w:r>
-        <w:t>težavnosti</w:t>
-      </w:r>
-      <w:proofErr w:type="spellEnd"/>
-      <w:r>
-        <w:t xml:space="preserve">, </w:t>
-      </w:r>
-      <w:proofErr w:type="spellStart"/>
-      <w:r>
-        <w:t>stopnje</w:t>
-      </w:r>
-      <w:proofErr w:type="spellEnd"/>
-      <w:r>
-        <w:t xml:space="preserve"> 1–3 </w:t>
-      </w:r>
-      <w:proofErr w:type="spellStart"/>
-      <w:r>
-        <w:t>pripadajo</w:t>
-      </w:r>
-      <w:proofErr w:type="spellEnd"/>
-      <w:r>
-        <w:t xml:space="preserve"> 3. </w:t>
-      </w:r>
-      <w:proofErr w:type="spellStart"/>
-      <w:r>
-        <w:t>razredu</w:t>
-      </w:r>
-      <w:proofErr w:type="spellEnd"/>
-      <w:r>
-        <w:t xml:space="preserve">, 4–6 6. </w:t>
-      </w:r>
-      <w:proofErr w:type="spellStart"/>
-      <w:r>
-        <w:t>razredu</w:t>
-      </w:r>
-      <w:proofErr w:type="spellEnd"/>
-      <w:r>
-        <w:t xml:space="preserve"> in 7–9 9. </w:t>
-      </w:r>
-      <w:proofErr w:type="spellStart"/>
-      <w:r>
-        <w:t>razredu</w:t>
-      </w:r>
-      <w:proofErr w:type="spellEnd"/>
-      <w:r>
-        <w:t xml:space="preserve">. </w:t>
-      </w:r>
-      <w:proofErr w:type="spellStart"/>
-      <w:r>
-        <w:t>Znotraj</w:t>
-      </w:r>
-      <w:proofErr w:type="spellEnd"/>
-      <w:r>
-        <w:t xml:space="preserve"> </w:t>
-      </w:r>
-      <w:proofErr w:type="spellStart"/>
-      <w:r>
-        <w:t>vsakega</w:t>
-      </w:r>
-      <w:proofErr w:type="spellEnd"/>
-      <w:r>
-        <w:t xml:space="preserve"> </w:t>
-      </w:r>
-      <w:proofErr w:type="spellStart"/>
-      <w:r>
-        <w:t>razreda</w:t>
-      </w:r>
-      <w:proofErr w:type="spellEnd"/>
-      <w:r>
-        <w:t xml:space="preserve"> so tri </w:t>
-      </w:r>
-      <w:proofErr w:type="spellStart"/>
-      <w:r>
-        <w:t>notranje</w:t>
-      </w:r>
-      <w:proofErr w:type="spellEnd"/>
-      <w:r>
-        <w:t xml:space="preserve"> </w:t>
-      </w:r>
-      <w:proofErr w:type="spellStart"/>
-      <w:r>
-        <w:t>stopnje</w:t>
-      </w:r>
-      <w:proofErr w:type="spellEnd"/>
-      <w:r>
-        <w:t xml:space="preserve">, ki </w:t>
-      </w:r>
-      <w:proofErr w:type="spellStart"/>
-      <w:r>
-        <w:t>vplivajo</w:t>
-      </w:r>
-      <w:proofErr w:type="spellEnd"/>
-      <w:r>
-        <w:t xml:space="preserve"> </w:t>
-      </w:r>
-      <w:proofErr w:type="spellStart"/>
-      <w:r>
-        <w:t>na</w:t>
-      </w:r>
-      <w:proofErr w:type="spellEnd"/>
-      <w:r>
-        <w:t xml:space="preserve"> </w:t>
-      </w:r>
-      <w:proofErr w:type="spellStart"/>
-      <w:r>
-        <w:t>velikost</w:t>
-      </w:r>
-      <w:proofErr w:type="spellEnd"/>
-      <w:r>
-        <w:t xml:space="preserve"> </w:t>
-      </w:r>
-      <w:proofErr w:type="spellStart"/>
-      <w:r>
-        <w:t>števil</w:t>
-      </w:r>
-      <w:proofErr w:type="spellEnd"/>
-      <w:r>
-        <w:t xml:space="preserve">, </w:t>
-      </w:r>
-      <w:proofErr w:type="spellStart"/>
-      <w:r>
-        <w:t>faktorjev</w:t>
-      </w:r>
-      <w:proofErr w:type="spellEnd"/>
-      <w:r>
-        <w:t xml:space="preserve">, </w:t>
-      </w:r>
-      <w:proofErr w:type="spellStart"/>
-      <w:r>
-        <w:t>imenovalcev</w:t>
-      </w:r>
-      <w:proofErr w:type="spellEnd"/>
-      <w:r>
-        <w:t xml:space="preserve"> in </w:t>
-      </w:r>
-      <w:proofErr w:type="spellStart"/>
-      <w:r>
-        <w:t>koeficientov</w:t>
-      </w:r>
-      <w:proofErr w:type="spellEnd"/>
-      <w:r>
-        <w:t xml:space="preserve">. Pri </w:t>
-      </w:r>
-      <w:proofErr w:type="spellStart"/>
-      <w:r>
-        <w:t>generiranju</w:t>
-      </w:r>
-      <w:proofErr w:type="spellEnd"/>
-      <w:r>
-        <w:t xml:space="preserve"> </w:t>
-      </w:r>
-      <w:proofErr w:type="spellStart"/>
-      <w:r>
-        <w:t>sem</w:t>
-      </w:r>
-      <w:proofErr w:type="spellEnd"/>
-      <w:r>
-        <w:t xml:space="preserve"> </w:t>
-      </w:r>
-      <w:proofErr w:type="spellStart"/>
-      <w:r>
-        <w:t>uporabil</w:t>
-      </w:r>
-      <w:proofErr w:type="spellEnd"/>
-      <w:r>
-        <w:t xml:space="preserve"> </w:t>
-      </w:r>
-      <w:proofErr w:type="spellStart"/>
-      <w:r>
-        <w:t>tudi</w:t>
-      </w:r>
-      <w:proofErr w:type="spellEnd"/>
-      <w:r>
-        <w:t xml:space="preserve"> </w:t>
-      </w:r>
-      <w:proofErr w:type="spellStart"/>
-      <w:r>
-        <w:t>Pitagorove</w:t>
-      </w:r>
-      <w:proofErr w:type="spellEnd"/>
-      <w:r>
-        <w:t xml:space="preserve"> </w:t>
-      </w:r>
-      <w:proofErr w:type="spellStart"/>
-      <w:r>
-        <w:t>trojice</w:t>
-      </w:r>
-      <w:proofErr w:type="spellEnd"/>
-      <w:r>
-        <w:t xml:space="preserve"> in </w:t>
-      </w:r>
-      <w:proofErr w:type="spellStart"/>
-      <w:r>
-        <w:t>popolne</w:t>
-      </w:r>
-      <w:proofErr w:type="spellEnd"/>
-      <w:r>
-        <w:t xml:space="preserve"> </w:t>
-      </w:r>
-      <w:proofErr w:type="spellStart"/>
-      <w:r>
-        <w:t>kvadrate</w:t>
-      </w:r>
-      <w:proofErr w:type="spellEnd"/>
-      <w:r>
-        <w:t xml:space="preserve">, da so </w:t>
-      </w:r>
-      <w:proofErr w:type="spellStart"/>
-      <w:r>
-        <w:t>rezultati</w:t>
-      </w:r>
-      <w:proofErr w:type="spellEnd"/>
-      <w:r>
-        <w:t xml:space="preserve"> </w:t>
-      </w:r>
-      <w:proofErr w:type="spellStart"/>
-      <w:r>
-        <w:t>enostavni</w:t>
-      </w:r>
-      <w:proofErr w:type="spellEnd"/>
-      <w:r>
-        <w:t xml:space="preserve"> in </w:t>
-      </w:r>
-      <w:proofErr w:type="spellStart"/>
-      <w:r>
-        <w:t>večinoma</w:t>
-      </w:r>
-      <w:proofErr w:type="spellEnd"/>
-      <w:r>
-        <w:t xml:space="preserve"> </w:t>
-      </w:r>
-      <w:proofErr w:type="spellStart"/>
-      <w:r>
-        <w:t>celoštevilski</w:t>
-      </w:r>
-      <w:proofErr w:type="spellEnd"/>
-      <w:r>
-        <w:t>.</w:t>
-      </w:r>
+      <w:pPr>
+        <w:rPr>
+          <w:lang w:val="sl-SI"/>
+        </w:rPr>
+      </w:pPr>
+      <w:hyperlink r:id="rId7" w:history="1">
+        <w:r>
+          <w:rPr>
+            <w:rStyle w:val="Hyperlink"/>
+            <w:lang w:val="sl-SI"/>
+          </w:rPr>
+          <w:t>https://www.gov.si/assets/ministrstva/MVI/Dokumenti/Osnovna-sola/Ucni-nacrti/Ucni-nacrti/2025/UN_OS/Ucni_nacrt_mat</w:t>
+        </w:r>
+        <w:r>
+          <w:rPr>
+            <w:rStyle w:val="Hyperlink"/>
+            <w:lang w:val="sl-SI"/>
+          </w:rPr>
+          <w:t>e</w:t>
+        </w:r>
+        <w:r>
+          <w:rPr>
+            <w:rStyle w:val="Hyperlink"/>
+            <w:lang w:val="sl-SI"/>
+          </w:rPr>
+          <w:t>matika_2025.pdf</w:t>
+        </w:r>
+      </w:hyperlink>
     </w:p>
     <w:p>
-      <w:r>
-        <w:t xml:space="preserve">Za </w:t>
-      </w:r>
-      <w:proofErr w:type="spellStart"/>
-      <w:r>
-        <w:t>vsako</w:t>
-      </w:r>
-      <w:proofErr w:type="spellEnd"/>
-      <w:r>
-        <w:t xml:space="preserve"> </w:t>
-      </w:r>
-      <w:proofErr w:type="spellStart"/>
-      <w:r>
-        <w:t>vprašanje</w:t>
-      </w:r>
-      <w:proofErr w:type="spellEnd"/>
-      <w:r>
-        <w:t xml:space="preserve"> se </w:t>
-      </w:r>
-      <w:proofErr w:type="spellStart"/>
-      <w:r>
-        <w:t>naključno</w:t>
-      </w:r>
-      <w:proofErr w:type="spellEnd"/>
-      <w:r>
-        <w:t xml:space="preserve"> </w:t>
-      </w:r>
-      <w:proofErr w:type="spellStart"/>
-      <w:r>
-        <w:t>izbere</w:t>
-      </w:r>
-      <w:proofErr w:type="spellEnd"/>
-      <w:r>
-        <w:t xml:space="preserve"> </w:t>
-      </w:r>
-      <w:proofErr w:type="spellStart"/>
-      <w:r>
-        <w:t>področje</w:t>
-      </w:r>
-      <w:proofErr w:type="spellEnd"/>
-      <w:r>
-        <w:t xml:space="preserve">, </w:t>
-      </w:r>
-      <w:proofErr w:type="spellStart"/>
-      <w:r>
-        <w:t>nato</w:t>
-      </w:r>
-      <w:proofErr w:type="spellEnd"/>
-      <w:r>
-        <w:t xml:space="preserve"> pa generator </w:t>
-      </w:r>
-      <w:proofErr w:type="spellStart"/>
-      <w:r>
-        <w:t>naključno</w:t>
-      </w:r>
-      <w:proofErr w:type="spellEnd"/>
-      <w:r>
-        <w:t xml:space="preserve"> </w:t>
-      </w:r>
-      <w:proofErr w:type="spellStart"/>
-      <w:r>
-        <w:t>določi</w:t>
-      </w:r>
-      <w:proofErr w:type="spellEnd"/>
-      <w:r>
-        <w:t xml:space="preserve"> </w:t>
-      </w:r>
-      <w:proofErr w:type="spellStart"/>
-      <w:r>
-        <w:t>konkretne</w:t>
-      </w:r>
-      <w:proofErr w:type="spellEnd"/>
-      <w:r>
-        <w:t xml:space="preserve"> </w:t>
-      </w:r>
-      <w:proofErr w:type="spellStart"/>
-      <w:r>
-        <w:t>podatke</w:t>
-      </w:r>
-      <w:proofErr w:type="spellEnd"/>
-      <w:r>
-        <w:t xml:space="preserve">. </w:t>
-      </w:r>
-      <w:proofErr w:type="spellStart"/>
-      <w:r>
-        <w:t>Zato</w:t>
-      </w:r>
-      <w:proofErr w:type="spellEnd"/>
-      <w:r>
-        <w:t xml:space="preserve"> se </w:t>
-      </w:r>
-      <w:proofErr w:type="spellStart"/>
-      <w:r>
-        <w:t>lahko</w:t>
-      </w:r>
-      <w:proofErr w:type="spellEnd"/>
-      <w:r>
-        <w:t xml:space="preserve"> </w:t>
-      </w:r>
-      <w:proofErr w:type="spellStart"/>
-      <w:r>
-        <w:t>isto</w:t>
-      </w:r>
-      <w:proofErr w:type="spellEnd"/>
-      <w:r>
-        <w:t xml:space="preserve"> </w:t>
-      </w:r>
-      <w:proofErr w:type="spellStart"/>
-      <w:r>
-        <w:t>področje</w:t>
-      </w:r>
-      <w:proofErr w:type="spellEnd"/>
-      <w:r>
-        <w:t xml:space="preserve"> </w:t>
-      </w:r>
-      <w:proofErr w:type="spellStart"/>
-      <w:r>
-        <w:t>pojavi</w:t>
-      </w:r>
-      <w:proofErr w:type="spellEnd"/>
-      <w:r>
-        <w:t xml:space="preserve"> </w:t>
-      </w:r>
-      <w:proofErr w:type="spellStart"/>
-      <w:r>
-        <w:t>večkrat</w:t>
-      </w:r>
-      <w:proofErr w:type="spellEnd"/>
-      <w:r>
-        <w:t xml:space="preserve">, </w:t>
-      </w:r>
-      <w:proofErr w:type="spellStart"/>
-      <w:r>
-        <w:t>vsa</w:t>
-      </w:r>
-      <w:proofErr w:type="spellEnd"/>
-      <w:r>
-        <w:t xml:space="preserve"> </w:t>
-      </w:r>
-      <w:proofErr w:type="spellStart"/>
-      <w:r>
-        <w:t>področja</w:t>
-      </w:r>
-      <w:proofErr w:type="spellEnd"/>
-      <w:r>
-        <w:t xml:space="preserve"> pa </w:t>
-      </w:r>
-      <w:proofErr w:type="spellStart"/>
-      <w:r>
-        <w:t>nimajo</w:t>
-      </w:r>
-      <w:proofErr w:type="spellEnd"/>
-      <w:r>
-        <w:t xml:space="preserve"> </w:t>
-      </w:r>
-      <w:proofErr w:type="spellStart"/>
-      <w:r>
-        <w:t>nujno</w:t>
-      </w:r>
-      <w:proofErr w:type="spellEnd"/>
-      <w:r>
-        <w:t xml:space="preserve"> </w:t>
-      </w:r>
-      <w:proofErr w:type="spellStart"/>
-      <w:r>
-        <w:t>enake</w:t>
-      </w:r>
-      <w:proofErr w:type="spellEnd"/>
-      <w:r>
-        <w:t xml:space="preserve"> </w:t>
-      </w:r>
-      <w:proofErr w:type="spellStart"/>
-      <w:r>
-        <w:t>zastopanosti</w:t>
-      </w:r>
-      <w:proofErr w:type="spellEnd"/>
-      <w:r>
-        <w:t xml:space="preserve"> v </w:t>
-      </w:r>
-      <w:proofErr w:type="spellStart"/>
-      <w:r>
-        <w:t>kratkem</w:t>
-      </w:r>
-      <w:proofErr w:type="spellEnd"/>
-      <w:r>
-        <w:t xml:space="preserve"> </w:t>
-      </w:r>
-      <w:proofErr w:type="spellStart"/>
-      <w:r>
-        <w:t>kvizu</w:t>
-      </w:r>
-      <w:proofErr w:type="spellEnd"/>
-      <w:r>
-        <w:t xml:space="preserve">. </w:t>
-      </w:r>
-      <w:proofErr w:type="spellStart"/>
-      <w:r>
-        <w:t>Dodal</w:t>
-      </w:r>
-      <w:proofErr w:type="spellEnd"/>
-      <w:r>
-        <w:t xml:space="preserve"> </w:t>
-      </w:r>
-      <w:proofErr w:type="spellStart"/>
-      <w:r>
-        <w:t>sem</w:t>
-      </w:r>
-      <w:proofErr w:type="spellEnd"/>
-      <w:r>
-        <w:t xml:space="preserve"> </w:t>
-      </w:r>
-      <w:proofErr w:type="spellStart"/>
-      <w:r>
-        <w:t>tudi</w:t>
-      </w:r>
-      <w:proofErr w:type="spellEnd"/>
-      <w:r>
-        <w:t xml:space="preserve"> </w:t>
-      </w:r>
-      <w:proofErr w:type="spellStart"/>
-      <w:r>
-        <w:t>fiksni</w:t>
-      </w:r>
-      <w:proofErr w:type="spellEnd"/>
-      <w:r>
-        <w:t xml:space="preserve"> in </w:t>
-      </w:r>
-      <w:proofErr w:type="spellStart"/>
-      <w:r>
-        <w:t>progresivni</w:t>
-      </w:r>
-      <w:proofErr w:type="spellEnd"/>
-      <w:r>
-        <w:t xml:space="preserve"> </w:t>
-      </w:r>
-      <w:proofErr w:type="spellStart"/>
-      <w:r>
-        <w:t>način</w:t>
-      </w:r>
-      <w:proofErr w:type="spellEnd"/>
-      <w:r>
-        <w:t xml:space="preserve">. </w:t>
-      </w:r>
-      <w:proofErr w:type="spellStart"/>
-      <w:r>
-        <w:t>Fiksni</w:t>
-      </w:r>
-      <w:proofErr w:type="spellEnd"/>
-      <w:r>
-        <w:t xml:space="preserve"> </w:t>
-      </w:r>
-      <w:proofErr w:type="spellStart"/>
-      <w:r>
-        <w:t>način</w:t>
-      </w:r>
-      <w:proofErr w:type="spellEnd"/>
-      <w:r>
-        <w:t xml:space="preserve"> </w:t>
-      </w:r>
-      <w:proofErr w:type="spellStart"/>
-      <w:r>
-        <w:t>uporablja</w:t>
-      </w:r>
-      <w:proofErr w:type="spellEnd"/>
-      <w:r>
-        <w:t xml:space="preserve"> </w:t>
-      </w:r>
-      <w:proofErr w:type="spellStart"/>
-      <w:r>
-        <w:t>samo</w:t>
-      </w:r>
-      <w:proofErr w:type="spellEnd"/>
-      <w:r>
-        <w:t xml:space="preserve"> </w:t>
-      </w:r>
-      <w:proofErr w:type="spellStart"/>
-      <w:r>
-        <w:t>izbrani</w:t>
-      </w:r>
-      <w:proofErr w:type="spellEnd"/>
-      <w:r>
-        <w:t xml:space="preserve"> </w:t>
-      </w:r>
-      <w:proofErr w:type="spellStart"/>
-      <w:r>
-        <w:t>razred</w:t>
-      </w:r>
-      <w:proofErr w:type="spellEnd"/>
-      <w:r>
-        <w:t xml:space="preserve">, </w:t>
-      </w:r>
-      <w:proofErr w:type="spellStart"/>
-      <w:r>
-        <w:t>progresivni</w:t>
-      </w:r>
-      <w:proofErr w:type="spellEnd"/>
-      <w:r>
-        <w:t xml:space="preserve"> pa </w:t>
-      </w:r>
-      <w:proofErr w:type="spellStart"/>
-      <w:r>
-        <w:t>vključi</w:t>
-      </w:r>
-      <w:proofErr w:type="spellEnd"/>
-      <w:r>
-        <w:t xml:space="preserve"> </w:t>
-      </w:r>
-      <w:proofErr w:type="spellStart"/>
-      <w:r>
-        <w:t>tudi</w:t>
-      </w:r>
-      <w:proofErr w:type="spellEnd"/>
-      <w:r>
-        <w:t xml:space="preserve"> </w:t>
-      </w:r>
-      <w:proofErr w:type="spellStart"/>
-      <w:r>
-        <w:t>vse</w:t>
-      </w:r>
-      <w:proofErr w:type="spellEnd"/>
-      <w:r>
-        <w:t xml:space="preserve"> </w:t>
-      </w:r>
-      <w:proofErr w:type="spellStart"/>
-      <w:r>
-        <w:t>predhodne</w:t>
-      </w:r>
-      <w:proofErr w:type="spellEnd"/>
-      <w:r>
-        <w:t xml:space="preserve"> </w:t>
-      </w:r>
-      <w:proofErr w:type="spellStart"/>
-      <w:r>
-        <w:t>razrede</w:t>
-      </w:r>
-      <w:proofErr w:type="spellEnd"/>
-      <w:r>
-        <w:t>. V API-</w:t>
-      </w:r>
-      <w:proofErr w:type="spellStart"/>
-      <w:r>
-        <w:t>ruto</w:t>
-      </w:r>
-      <w:proofErr w:type="spellEnd"/>
-      <w:r>
-        <w:t xml:space="preserve"> </w:t>
-      </w:r>
-      <w:proofErr w:type="spellStart"/>
-      <w:r>
-        <w:t>sem</w:t>
-      </w:r>
-      <w:proofErr w:type="spellEnd"/>
-      <w:r>
-        <w:t xml:space="preserve"> </w:t>
-      </w:r>
-      <w:proofErr w:type="spellStart"/>
-      <w:r>
-        <w:t>dodal</w:t>
-      </w:r>
-      <w:proofErr w:type="spellEnd"/>
-      <w:r>
-        <w:t xml:space="preserve"> </w:t>
-      </w:r>
-      <w:proofErr w:type="spellStart"/>
-      <w:r>
-        <w:t>možnost</w:t>
-      </w:r>
-      <w:proofErr w:type="spellEnd"/>
-      <w:r>
-        <w:t xml:space="preserve"> </w:t>
-      </w:r>
-      <w:proofErr w:type="spellStart"/>
-      <w:r>
-        <w:t>izbire</w:t>
-      </w:r>
-      <w:proofErr w:type="spellEnd"/>
-      <w:r>
-        <w:t xml:space="preserve"> </w:t>
-      </w:r>
-      <w:proofErr w:type="spellStart"/>
-      <w:r>
-        <w:t>tega</w:t>
-      </w:r>
-      <w:proofErr w:type="spellEnd"/>
-      <w:r>
-        <w:t xml:space="preserve"> </w:t>
-      </w:r>
-      <w:proofErr w:type="spellStart"/>
-      <w:r>
-        <w:t>načina</w:t>
-      </w:r>
-      <w:proofErr w:type="spellEnd"/>
-      <w:r>
-        <w:t xml:space="preserve">. Čas </w:t>
-      </w:r>
-      <w:proofErr w:type="spellStart"/>
-      <w:r>
-        <w:t>reševanja</w:t>
-      </w:r>
-      <w:proofErr w:type="spellEnd"/>
-      <w:r>
-        <w:t xml:space="preserve"> je </w:t>
-      </w:r>
-      <w:proofErr w:type="spellStart"/>
-      <w:r>
-        <w:t>odvisen</w:t>
-      </w:r>
-      <w:proofErr w:type="spellEnd"/>
-      <w:r>
-        <w:t xml:space="preserve"> od </w:t>
-      </w:r>
-      <w:proofErr w:type="spellStart"/>
-      <w:r>
-        <w:t>notranje</w:t>
-      </w:r>
-      <w:proofErr w:type="spellEnd"/>
-      <w:r>
-        <w:t xml:space="preserve"> </w:t>
-      </w:r>
-      <w:proofErr w:type="spellStart"/>
-      <w:r>
-        <w:t>stopnje</w:t>
-      </w:r>
-      <w:proofErr w:type="spellEnd"/>
-      <w:r>
-        <w:t xml:space="preserve"> in </w:t>
-      </w:r>
-      <w:proofErr w:type="spellStart"/>
-      <w:r>
-        <w:t>znaša</w:t>
-      </w:r>
-      <w:proofErr w:type="spellEnd"/>
-      <w:r>
-        <w:t xml:space="preserve"> 45, 30 </w:t>
-      </w:r>
-      <w:proofErr w:type="spellStart"/>
-      <w:r>
-        <w:t>ali</w:t>
-      </w:r>
-      <w:proofErr w:type="spellEnd"/>
-      <w:r>
-        <w:t xml:space="preserve"> 20 </w:t>
-      </w:r>
-      <w:proofErr w:type="spellStart"/>
-      <w:r>
-        <w:t>sekund</w:t>
-      </w:r>
-      <w:proofErr w:type="spellEnd"/>
-      <w:r>
-        <w:t xml:space="preserve">. </w:t>
-      </w:r>
-      <w:proofErr w:type="spellStart"/>
-      <w:r>
-        <w:t>Verjetno</w:t>
-      </w:r>
-      <w:proofErr w:type="spellEnd"/>
-      <w:r>
-        <w:t xml:space="preserve"> </w:t>
-      </w:r>
-      <w:proofErr w:type="spellStart"/>
-      <w:r>
-        <w:t>bom</w:t>
-      </w:r>
-      <w:proofErr w:type="spellEnd"/>
-      <w:r>
-        <w:t xml:space="preserve"> </w:t>
-      </w:r>
-      <w:proofErr w:type="spellStart"/>
-      <w:r>
-        <w:t>delovanje</w:t>
-      </w:r>
-      <w:proofErr w:type="spellEnd"/>
-      <w:r>
-        <w:t xml:space="preserve"> </w:t>
-      </w:r>
-      <w:proofErr w:type="spellStart"/>
-      <w:r>
-        <w:t>teh</w:t>
-      </w:r>
-      <w:proofErr w:type="spellEnd"/>
-      <w:r>
-        <w:t xml:space="preserve"> </w:t>
-      </w:r>
-      <w:proofErr w:type="spellStart"/>
-      <w:r>
-        <w:t>dveh</w:t>
-      </w:r>
-      <w:proofErr w:type="spellEnd"/>
-      <w:r>
-        <w:t xml:space="preserve"> </w:t>
-      </w:r>
-      <w:proofErr w:type="spellStart"/>
-      <w:r>
-        <w:t>načinov</w:t>
-      </w:r>
-      <w:proofErr w:type="spellEnd"/>
-      <w:r>
-        <w:t xml:space="preserve"> </w:t>
-      </w:r>
-      <w:proofErr w:type="spellStart"/>
-      <w:r>
-        <w:t>še</w:t>
-      </w:r>
-      <w:proofErr w:type="spellEnd"/>
-      <w:r>
-        <w:t xml:space="preserve"> </w:t>
-      </w:r>
-      <w:proofErr w:type="spellStart"/>
-      <w:r>
-        <w:t>spremenil</w:t>
-      </w:r>
-      <w:proofErr w:type="spellEnd"/>
-      <w:r>
-        <w:t>.</w:t>
+      <w:pPr>
+        <w:rPr>
+          <w:lang w:val="sl-SI"/>
+        </w:rPr>
+      </w:pPr>
+      <w:proofErr w:type="spellStart"/>
+      <w:r>
+        <w:rPr>
+          <w:lang w:val="sl-SI"/>
+        </w:rPr>
+        <w:t>Ric</w:t>
+      </w:r>
+      <w:proofErr w:type="spellEnd"/>
+      <w:r>
+        <w:rPr>
+          <w:lang w:val="sl-SI"/>
+        </w:rPr>
+        <w:t xml:space="preserve"> strani, kjer sem našel dokumente za vsak NPZ:</w:t>
       </w:r>
     </w:p>
     <w:p>
-      <w:proofErr w:type="spellStart"/>
-      <w:r>
-        <w:lastRenderedPageBreak/>
+      <w:pPr>
+        <w:rPr>
+          <w:lang w:val="sl-SI"/>
+        </w:rPr>
+      </w:pPr>
+      <w:hyperlink r:id="rId8" w:history="1">
+        <w:r>
+          <w:rPr>
+            <w:rStyle w:val="Hyperlink"/>
+            <w:lang w:val="sl-SI"/>
+          </w:rPr>
+          <w:t>https://www.ric.si/nacionalno-preverjanje-znanja/predmeti-npz/predmeti-v-3%20-razredu/matematika/</w:t>
+        </w:r>
+      </w:hyperlink>
+    </w:p>
+    <w:p>
+      <w:pPr>
+        <w:rPr>
+          <w:lang w:val="sl-SI"/>
+        </w:rPr>
+      </w:pPr>
+      <w:hyperlink r:id="rId9" w:history="1">
+        <w:r>
+          <w:rPr>
+            <w:rStyle w:val="Hyperlink"/>
+            <w:lang w:val="sl-SI"/>
+          </w:rPr>
+          <w:t>https://www.ric.si/nacionalno-preverjanje-znanja/predmeti-npz/predmeti-v-6%20-razredu/matematika/</w:t>
+        </w:r>
+      </w:hyperlink>
+    </w:p>
+    <w:p>
+      <w:pPr>
+        <w:rPr>
+          <w:lang w:val="sl-SI"/>
+        </w:rPr>
+      </w:pPr>
+      <w:hyperlink r:id="rId10" w:history="1">
+        <w:r>
+          <w:rPr>
+            <w:rStyle w:val="Hyperlink"/>
+            <w:lang w:val="sl-SI"/>
+          </w:rPr>
+          <w:t>https://www.ric.si/nacionalno-preverjanje-znanja/predmeti-npz/predmeti-v-9%20-razredu/matematika/</w:t>
+        </w:r>
+      </w:hyperlink>
+    </w:p>
+    <w:p>
+      <w:pPr>
+        <w:rPr>
+          <w:lang w:val="sl-SI"/>
+        </w:rPr>
+      </w:pPr>
+      <w:hyperlink r:id="rId11" w:history="1">
+        <w:r>
+          <w:rPr>
+            <w:rStyle w:val="Hyperlink"/>
+            <w:lang w:val="sl-SI"/>
+          </w:rPr>
+          <w:t>https://www.ric.si/nacionalno-preverjanje-znanja/predmeti-npz/predmeti-v-9%20-razredu/fizika/</w:t>
+        </w:r>
+      </w:hyperlink>
+    </w:p>
+    <w:p>
+      <w:pPr>
+        <w:rPr>
+          <w:lang w:val="sl-SI"/>
+        </w:rPr>
+      </w:pPr>
+      <w:proofErr w:type="spellStart"/>
+      <w:r>
+        <w:rPr>
+          <w:lang w:val="sl-SI"/>
+        </w:rPr>
+        <w:t>Stuktura</w:t>
+      </w:r>
+      <w:proofErr w:type="spellEnd"/>
+      <w:r>
+        <w:rPr>
+          <w:lang w:val="sl-SI"/>
+        </w:rPr>
+        <w:t xml:space="preserve"> in opis preizkusa znanja, dokument za vsak NPZ:</w:t>
+      </w:r>
+    </w:p>
+    <w:p>
+      <w:pPr>
+        <w:rPr>
+          <w:lang w:val="sl-SI"/>
+        </w:rPr>
+      </w:pPr>
+      <w:hyperlink r:id="rId12" w:history="1">
+        <w:r>
+          <w:rPr>
+            <w:rStyle w:val="Hyperlink"/>
+            <w:lang w:val="sl-SI"/>
+          </w:rPr>
+          <w:t>https://www.ric.si/mma/Struktura_preizkusa_NPZ_MAT__3_2026_27.pdf/2026061812391930/?m=1781779159</w:t>
+        </w:r>
+      </w:hyperlink>
+    </w:p>
+    <w:p>
+      <w:pPr>
+        <w:rPr>
+          <w:lang w:val="sl-SI"/>
+        </w:rPr>
+      </w:pPr>
+      <w:hyperlink r:id="rId13" w:history="1">
+        <w:r>
+          <w:rPr>
+            <w:rStyle w:val="Hyperlink"/>
+            <w:lang w:val="sl-SI"/>
+          </w:rPr>
+          <w:t>https://www.ric.si/mma/Struktura_NPZ_MAT_6_2026_27.pdf/2026061812391996/?m=1781779159</w:t>
+        </w:r>
+      </w:hyperlink>
+    </w:p>
+    <w:p>
+      <w:pPr>
+        <w:rPr>
+          <w:lang w:val="sl-SI"/>
+        </w:rPr>
+      </w:pPr>
+      <w:hyperlink r:id="rId14" w:history="1">
+        <w:r>
+          <w:rPr>
+            <w:rStyle w:val="Hyperlink"/>
+            <w:lang w:val="sl-SI"/>
+          </w:rPr>
+          <w:t>https://www.ric.si/mma/Struktura_NPZ_MAT_9_2026_27.pdf/2026061812391948/?m=1781779159</w:t>
+        </w:r>
+      </w:hyperlink>
+    </w:p>
+    <w:p>
+      <w:pPr>
+        <w:rPr>
+          <w:lang w:val="sl-SI"/>
+        </w:rPr>
+      </w:pPr>
+      <w:hyperlink r:id="rId15" w:history="1">
+        <w:r>
+          <w:rPr>
+            <w:rStyle w:val="Hyperlink"/>
+            <w:lang w:val="sl-SI"/>
+          </w:rPr>
+          <w:t>https://www.ric.si/mma/Struktura_NPZ_FIZ_9_2026_27.pdf/2026090909071238/?m=1788937632</w:t>
+        </w:r>
+      </w:hyperlink>
+    </w:p>
+    <w:p>
+      <w:pPr>
+        <w:pStyle w:val="Heading1"/>
+      </w:pPr>
+      <w:bookmarkStart w:id="3" w:name="_Toc243909914"/>
+      <w:proofErr w:type="spellStart"/>
+      <w:r>
+        <w:t>Poročilo</w:t>
+      </w:r>
+      <w:proofErr w:type="spellEnd"/>
+      <w:r>
+        <w:t xml:space="preserve"> za </w:t>
+      </w:r>
+      <w:proofErr w:type="spellStart"/>
+      <w:r>
+        <w:t>drugi</w:t>
+      </w:r>
+      <w:proofErr w:type="spellEnd"/>
+      <w:r>
+        <w:t xml:space="preserve"> </w:t>
+      </w:r>
+      <w:proofErr w:type="spellStart"/>
+      <w:r>
+        <w:t>teden</w:t>
+      </w:r>
+      <w:bookmarkEnd w:id="3"/>
+      <w:proofErr w:type="spellEnd"/>
+    </w:p>
+    <w:p>
+      <w:proofErr w:type="spellStart"/>
+      <w:r>
+        <w:t>Vse</w:t>
+      </w:r>
+      <w:proofErr w:type="spellEnd"/>
+      <w:r>
+        <w:t xml:space="preserve"> </w:t>
+      </w:r>
+      <w:proofErr w:type="spellStart"/>
+      <w:r>
+        <w:t>skupaj</w:t>
+      </w:r>
+      <w:proofErr w:type="spellEnd"/>
+      <w:r>
+        <w:t xml:space="preserve"> </w:t>
+      </w:r>
+      <w:proofErr w:type="spellStart"/>
+      <w:r>
+        <w:t>sem</w:t>
+      </w:r>
+      <w:proofErr w:type="spellEnd"/>
+      <w:r>
+        <w:t xml:space="preserve"> </w:t>
+      </w:r>
+      <w:proofErr w:type="spellStart"/>
+      <w:r>
+        <w:t>porabil</w:t>
+      </w:r>
+      <w:proofErr w:type="spellEnd"/>
+      <w:r>
+        <w:t xml:space="preserve"> </w:t>
+      </w:r>
+      <w:proofErr w:type="spellStart"/>
+      <w:r>
+        <w:t>približno</w:t>
+      </w:r>
+      <w:proofErr w:type="spellEnd"/>
+      <w:r>
+        <w:t xml:space="preserve"> 4 </w:t>
+      </w:r>
+      <w:proofErr w:type="spellStart"/>
+      <w:r>
+        <w:t>ure</w:t>
+      </w:r>
+      <w:proofErr w:type="spellEnd"/>
+      <w:r>
+        <w:t>.</w:t>
+      </w:r>
+    </w:p>
+    <w:p>
+      <w:r>
+        <w:t xml:space="preserve">V </w:t>
+      </w:r>
+      <w:proofErr w:type="spellStart"/>
+      <w:r>
+        <w:t>datoteki</w:t>
+      </w:r>
+      <w:proofErr w:type="spellEnd"/>
+      <w:r>
+        <w:t xml:space="preserve"> </w:t>
+      </w:r>
+      <w:proofErr w:type="spellStart"/>
+      <w:proofErr w:type="gramStart"/>
+      <w:r>
+        <w:t>question.generators</w:t>
+      </w:r>
+      <w:proofErr w:type="gramEnd"/>
+      <w:r>
+        <w:t>.ts</w:t>
+      </w:r>
+      <w:proofErr w:type="spellEnd"/>
+      <w:r>
+        <w:t xml:space="preserve"> </w:t>
+      </w:r>
+      <w:proofErr w:type="spellStart"/>
+      <w:r>
+        <w:t>sem</w:t>
+      </w:r>
+      <w:proofErr w:type="spellEnd"/>
+      <w:r>
+        <w:t xml:space="preserve"> </w:t>
+      </w:r>
+      <w:proofErr w:type="spellStart"/>
+      <w:r>
+        <w:t>implementiral</w:t>
+      </w:r>
+      <w:proofErr w:type="spellEnd"/>
+      <w:r>
+        <w:t xml:space="preserve"> </w:t>
+      </w:r>
+      <w:proofErr w:type="spellStart"/>
+      <w:r>
+        <w:t>sistem</w:t>
+      </w:r>
+      <w:proofErr w:type="spellEnd"/>
+      <w:r>
+        <w:t xml:space="preserve"> za </w:t>
+      </w:r>
+      <w:proofErr w:type="spellStart"/>
+      <w:r>
+        <w:t>samodejno</w:t>
+      </w:r>
+      <w:proofErr w:type="spellEnd"/>
+      <w:r>
+        <w:t xml:space="preserve"> </w:t>
+      </w:r>
+      <w:proofErr w:type="spellStart"/>
+      <w:r>
+        <w:t>generiranje</w:t>
+      </w:r>
+      <w:proofErr w:type="spellEnd"/>
+      <w:r>
+        <w:t xml:space="preserve"> </w:t>
+      </w:r>
+      <w:proofErr w:type="spellStart"/>
+      <w:r>
+        <w:t>matematičnih</w:t>
+      </w:r>
+      <w:proofErr w:type="spellEnd"/>
+      <w:r>
+        <w:t xml:space="preserve"> </w:t>
+      </w:r>
+      <w:proofErr w:type="spellStart"/>
+      <w:r>
+        <w:t>vprašanj</w:t>
+      </w:r>
+      <w:proofErr w:type="spellEnd"/>
+      <w:r>
+        <w:t xml:space="preserve">. Poleg </w:t>
+      </w:r>
+      <w:proofErr w:type="spellStart"/>
+      <w:r>
+        <w:t>seštevanja</w:t>
+      </w:r>
+      <w:proofErr w:type="spellEnd"/>
+      <w:r>
+        <w:t xml:space="preserve">, </w:t>
+      </w:r>
+      <w:proofErr w:type="spellStart"/>
+      <w:r>
+        <w:t>odštevanja</w:t>
+      </w:r>
+      <w:proofErr w:type="spellEnd"/>
+      <w:r>
+        <w:t xml:space="preserve"> in </w:t>
+      </w:r>
+      <w:proofErr w:type="spellStart"/>
+      <w:r>
+        <w:t>množenja</w:t>
+      </w:r>
+      <w:proofErr w:type="spellEnd"/>
+      <w:r>
+        <w:t xml:space="preserve"> </w:t>
+      </w:r>
+      <w:proofErr w:type="spellStart"/>
+      <w:r>
+        <w:t>sem</w:t>
+      </w:r>
+      <w:proofErr w:type="spellEnd"/>
+      <w:r>
+        <w:t xml:space="preserve"> </w:t>
+      </w:r>
+      <w:proofErr w:type="spellStart"/>
+      <w:r>
+        <w:t>dodal</w:t>
+      </w:r>
+      <w:proofErr w:type="spellEnd"/>
+      <w:r>
+        <w:t xml:space="preserve"> </w:t>
+      </w:r>
+      <w:proofErr w:type="spellStart"/>
+      <w:r>
+        <w:t>generatorje</w:t>
+      </w:r>
+      <w:proofErr w:type="spellEnd"/>
+      <w:r>
+        <w:t xml:space="preserve"> za </w:t>
+      </w:r>
+      <w:proofErr w:type="spellStart"/>
+      <w:r>
+        <w:t>vsa</w:t>
+      </w:r>
+      <w:proofErr w:type="spellEnd"/>
+      <w:r>
+        <w:t xml:space="preserve"> </w:t>
+      </w:r>
+      <w:proofErr w:type="spellStart"/>
+      <w:r>
+        <w:t>področja</w:t>
+      </w:r>
+      <w:proofErr w:type="spellEnd"/>
+      <w:r>
+        <w:t xml:space="preserve"> </w:t>
+      </w:r>
+      <w:proofErr w:type="spellStart"/>
+      <w:r>
+        <w:t>matematike</w:t>
+      </w:r>
+      <w:proofErr w:type="spellEnd"/>
+      <w:r>
+        <w:t xml:space="preserve"> v 3., 6. in 9. </w:t>
+      </w:r>
+      <w:proofErr w:type="spellStart"/>
+      <w:r>
+        <w:t>razredu</w:t>
+      </w:r>
+      <w:proofErr w:type="spellEnd"/>
+      <w:r>
+        <w:t xml:space="preserve"> </w:t>
+      </w:r>
+      <w:proofErr w:type="spellStart"/>
+      <w:r>
+        <w:t>osnovne</w:t>
+      </w:r>
+      <w:proofErr w:type="spellEnd"/>
+      <w:r>
+        <w:t xml:space="preserve"> </w:t>
+      </w:r>
+      <w:proofErr w:type="spellStart"/>
+      <w:r>
+        <w:t>šole</w:t>
+      </w:r>
+      <w:proofErr w:type="spellEnd"/>
+      <w:r>
+        <w:t xml:space="preserve">, ki </w:t>
+      </w:r>
+      <w:proofErr w:type="spellStart"/>
+      <w:r>
+        <w:t>sem</w:t>
+      </w:r>
+      <w:proofErr w:type="spellEnd"/>
+      <w:r>
+        <w:t xml:space="preserve"> </w:t>
+      </w:r>
+      <w:proofErr w:type="spellStart"/>
+      <w:r>
+        <w:t>jih</w:t>
+      </w:r>
+      <w:proofErr w:type="spellEnd"/>
+      <w:r>
+        <w:t xml:space="preserve"> </w:t>
+      </w:r>
+      <w:proofErr w:type="spellStart"/>
+      <w:r>
+        <w:t>določil</w:t>
+      </w:r>
+      <w:proofErr w:type="spellEnd"/>
+      <w:r>
+        <w:t xml:space="preserve"> v </w:t>
+      </w:r>
+      <w:proofErr w:type="spellStart"/>
+      <w:r>
+        <w:t>prejšnjem</w:t>
+      </w:r>
+      <w:proofErr w:type="spellEnd"/>
+      <w:r>
+        <w:t xml:space="preserve"> </w:t>
+      </w:r>
+      <w:proofErr w:type="spellStart"/>
+      <w:r>
+        <w:t>poročilu</w:t>
+      </w:r>
+      <w:proofErr w:type="spellEnd"/>
+      <w:r>
+        <w:t>.</w:t>
+      </w:r>
+    </w:p>
+    <w:p>
+      <w:r>
+        <w:t xml:space="preserve">Za 3. </w:t>
+      </w:r>
+      <w:proofErr w:type="spellStart"/>
+      <w:r>
+        <w:t>razred</w:t>
+      </w:r>
+      <w:proofErr w:type="spellEnd"/>
+      <w:r>
+        <w:t xml:space="preserve"> </w:t>
+      </w:r>
+      <w:proofErr w:type="spellStart"/>
+      <w:r>
+        <w:t>sem</w:t>
+      </w:r>
+      <w:proofErr w:type="spellEnd"/>
+      <w:r>
+        <w:t xml:space="preserve"> </w:t>
+      </w:r>
+      <w:proofErr w:type="spellStart"/>
+      <w:r>
+        <w:t>implementiral</w:t>
+      </w:r>
+      <w:proofErr w:type="spellEnd"/>
+      <w:r>
+        <w:t xml:space="preserve"> </w:t>
+      </w:r>
+      <w:proofErr w:type="spellStart"/>
+      <w:r>
+        <w:t>množenje</w:t>
+      </w:r>
+      <w:proofErr w:type="spellEnd"/>
+      <w:r>
+        <w:t xml:space="preserve">, </w:t>
+      </w:r>
+      <w:proofErr w:type="spellStart"/>
+      <w:r>
+        <w:t>deljenje</w:t>
+      </w:r>
+      <w:proofErr w:type="spellEnd"/>
+      <w:r>
+        <w:t xml:space="preserve"> </w:t>
+      </w:r>
+      <w:proofErr w:type="spellStart"/>
+      <w:r>
+        <w:t>brez</w:t>
+      </w:r>
+      <w:proofErr w:type="spellEnd"/>
+      <w:r>
+        <w:t xml:space="preserve"> </w:t>
+      </w:r>
+      <w:proofErr w:type="spellStart"/>
+      <w:r>
+        <w:t>ostanka</w:t>
+      </w:r>
+      <w:proofErr w:type="spellEnd"/>
+      <w:r>
+        <w:t xml:space="preserve">, </w:t>
+      </w:r>
+      <w:proofErr w:type="spellStart"/>
+      <w:r>
+        <w:t>seštevanje</w:t>
+      </w:r>
+      <w:proofErr w:type="spellEnd"/>
+      <w:r>
+        <w:t xml:space="preserve"> in </w:t>
+      </w:r>
+      <w:proofErr w:type="spellStart"/>
+      <w:r>
+        <w:t>odštevanje</w:t>
+      </w:r>
+      <w:proofErr w:type="spellEnd"/>
+      <w:r>
+        <w:t xml:space="preserve">, </w:t>
+      </w:r>
+      <w:proofErr w:type="spellStart"/>
+      <w:r>
+        <w:t>dopolnjevanje</w:t>
+      </w:r>
+      <w:proofErr w:type="spellEnd"/>
+      <w:r>
+        <w:t xml:space="preserve"> </w:t>
+      </w:r>
+      <w:proofErr w:type="spellStart"/>
+      <w:r>
+        <w:t>računov</w:t>
+      </w:r>
+      <w:proofErr w:type="spellEnd"/>
+      <w:r>
+        <w:t xml:space="preserve"> ter </w:t>
+      </w:r>
+      <w:proofErr w:type="spellStart"/>
+      <w:r>
+        <w:t>čas</w:t>
+      </w:r>
+      <w:proofErr w:type="spellEnd"/>
+      <w:r>
+        <w:t xml:space="preserve"> in </w:t>
+      </w:r>
+      <w:proofErr w:type="spellStart"/>
+      <w:r>
+        <w:t>merske</w:t>
+      </w:r>
+      <w:proofErr w:type="spellEnd"/>
+      <w:r>
+        <w:t xml:space="preserve"> </w:t>
+      </w:r>
+      <w:proofErr w:type="spellStart"/>
+      <w:r>
+        <w:t>enote</w:t>
+      </w:r>
+      <w:proofErr w:type="spellEnd"/>
+      <w:r>
+        <w:t xml:space="preserve">. Za 6. </w:t>
+      </w:r>
+      <w:proofErr w:type="spellStart"/>
+      <w:r>
+        <w:t>razred</w:t>
+      </w:r>
+      <w:proofErr w:type="spellEnd"/>
+      <w:r>
+        <w:t xml:space="preserve"> </w:t>
+      </w:r>
+      <w:proofErr w:type="spellStart"/>
+      <w:r>
+        <w:t>deljenje</w:t>
+      </w:r>
+      <w:proofErr w:type="spellEnd"/>
+      <w:r>
+        <w:t xml:space="preserve"> </w:t>
+      </w:r>
+      <w:proofErr w:type="spellStart"/>
+      <w:r>
+        <w:t>naravnih</w:t>
+      </w:r>
+      <w:proofErr w:type="spellEnd"/>
+      <w:r>
+        <w:t xml:space="preserve"> </w:t>
+      </w:r>
+      <w:proofErr w:type="spellStart"/>
+      <w:r>
+        <w:t>števil</w:t>
+      </w:r>
+      <w:proofErr w:type="spellEnd"/>
+      <w:r>
+        <w:t xml:space="preserve">, </w:t>
+      </w:r>
+      <w:proofErr w:type="spellStart"/>
+      <w:r>
+        <w:t>ulomki</w:t>
+      </w:r>
+      <w:proofErr w:type="spellEnd"/>
+      <w:r>
+        <w:t xml:space="preserve">, </w:t>
+      </w:r>
+      <w:proofErr w:type="spellStart"/>
+      <w:r>
+        <w:t>obseg</w:t>
+      </w:r>
+      <w:proofErr w:type="spellEnd"/>
+      <w:r>
+        <w:t xml:space="preserve"> in </w:t>
+      </w:r>
+      <w:proofErr w:type="spellStart"/>
+      <w:r>
+        <w:t>ploščina</w:t>
+      </w:r>
+      <w:proofErr w:type="spellEnd"/>
+      <w:r>
+        <w:t xml:space="preserve">, </w:t>
+      </w:r>
+      <w:proofErr w:type="spellStart"/>
+      <w:r>
+        <w:t>številski</w:t>
+      </w:r>
+      <w:proofErr w:type="spellEnd"/>
+      <w:r>
+        <w:t xml:space="preserve"> </w:t>
+      </w:r>
+      <w:proofErr w:type="spellStart"/>
+      <w:r>
+        <w:t>izrazi</w:t>
+      </w:r>
+      <w:proofErr w:type="spellEnd"/>
+      <w:r>
+        <w:t xml:space="preserve"> ter </w:t>
+      </w:r>
+      <w:proofErr w:type="spellStart"/>
+      <w:r>
+        <w:t>večkratniki</w:t>
+      </w:r>
+      <w:proofErr w:type="spellEnd"/>
+      <w:r>
+        <w:t xml:space="preserve"> in </w:t>
+      </w:r>
+      <w:proofErr w:type="spellStart"/>
+      <w:r>
+        <w:t>delitelji</w:t>
+      </w:r>
+      <w:proofErr w:type="spellEnd"/>
+      <w:r>
+        <w:t xml:space="preserve">. Za 9. </w:t>
+      </w:r>
+      <w:proofErr w:type="spellStart"/>
+      <w:r>
+        <w:t>razred</w:t>
+      </w:r>
+      <w:proofErr w:type="spellEnd"/>
+      <w:r>
+        <w:t xml:space="preserve"> pa </w:t>
+      </w:r>
+      <w:proofErr w:type="spellStart"/>
+      <w:r>
+        <w:t>odstotki</w:t>
+      </w:r>
+      <w:proofErr w:type="spellEnd"/>
+      <w:r>
+        <w:t xml:space="preserve">, </w:t>
+      </w:r>
+      <w:proofErr w:type="spellStart"/>
+      <w:r>
+        <w:t>linearne</w:t>
+      </w:r>
+      <w:proofErr w:type="spellEnd"/>
+      <w:r>
+        <w:t xml:space="preserve"> </w:t>
+      </w:r>
+      <w:proofErr w:type="spellStart"/>
+      <w:r>
+        <w:t>enačbe</w:t>
+      </w:r>
+      <w:proofErr w:type="spellEnd"/>
+      <w:r>
+        <w:t xml:space="preserve">, </w:t>
+      </w:r>
+      <w:proofErr w:type="spellStart"/>
+      <w:r>
+        <w:t>funkcije</w:t>
+      </w:r>
+      <w:proofErr w:type="spellEnd"/>
+      <w:r>
+        <w:t xml:space="preserve"> in </w:t>
+      </w:r>
+      <w:proofErr w:type="spellStart"/>
+      <w:r>
+        <w:t>grafi</w:t>
+      </w:r>
+      <w:proofErr w:type="spellEnd"/>
+      <w:r>
+        <w:t xml:space="preserve">, </w:t>
+      </w:r>
+      <w:proofErr w:type="spellStart"/>
+      <w:r>
+        <w:t>Pitagorov</w:t>
+      </w:r>
+      <w:proofErr w:type="spellEnd"/>
+      <w:r>
+        <w:t xml:space="preserve"> </w:t>
+      </w:r>
+      <w:proofErr w:type="spellStart"/>
+      <w:r>
+        <w:t>izrek</w:t>
+      </w:r>
+      <w:proofErr w:type="spellEnd"/>
+      <w:r>
+        <w:t xml:space="preserve"> ter potence in </w:t>
+      </w:r>
+      <w:proofErr w:type="spellStart"/>
+      <w:r>
+        <w:t>kvadratni</w:t>
+      </w:r>
+      <w:proofErr w:type="spellEnd"/>
+      <w:r>
+        <w:t xml:space="preserve"> </w:t>
+      </w:r>
+      <w:proofErr w:type="spellStart"/>
+      <w:r>
+        <w:t>koreni</w:t>
+      </w:r>
+      <w:proofErr w:type="spellEnd"/>
+      <w:r>
+        <w:t>.</w:t>
+      </w:r>
+    </w:p>
+    <w:p>
+      <w:proofErr w:type="spellStart"/>
+      <w:r>
+        <w:t>Dodal</w:t>
+      </w:r>
+      <w:proofErr w:type="spellEnd"/>
+      <w:r>
+        <w:t xml:space="preserve"> </w:t>
+      </w:r>
+      <w:proofErr w:type="spellStart"/>
+      <w:r>
+        <w:t>sem</w:t>
+      </w:r>
+      <w:proofErr w:type="spellEnd"/>
+      <w:r>
+        <w:t xml:space="preserve"> </w:t>
+      </w:r>
+      <w:proofErr w:type="spellStart"/>
+      <w:r>
+        <w:t>lestvico</w:t>
+      </w:r>
+      <w:proofErr w:type="spellEnd"/>
+      <w:r>
+        <w:t xml:space="preserve"> </w:t>
+      </w:r>
+      <w:proofErr w:type="spellStart"/>
+      <w:r>
+        <w:t>težavnosti</w:t>
+      </w:r>
+      <w:proofErr w:type="spellEnd"/>
+      <w:r>
+        <w:t xml:space="preserve">, </w:t>
+      </w:r>
+      <w:proofErr w:type="spellStart"/>
+      <w:r>
+        <w:t>stopnje</w:t>
+      </w:r>
+      <w:proofErr w:type="spellEnd"/>
+      <w:r>
+        <w:t xml:space="preserve"> 1–3 </w:t>
+      </w:r>
+      <w:proofErr w:type="spellStart"/>
+      <w:r>
+        <w:t>pripadajo</w:t>
+      </w:r>
+      <w:proofErr w:type="spellEnd"/>
+      <w:r>
+        <w:t xml:space="preserve"> 3. </w:t>
+      </w:r>
+      <w:proofErr w:type="spellStart"/>
+      <w:r>
+        <w:t>razredu</w:t>
+      </w:r>
+      <w:proofErr w:type="spellEnd"/>
+      <w:r>
+        <w:t xml:space="preserve">, 4–6 6. </w:t>
+      </w:r>
+      <w:proofErr w:type="spellStart"/>
+      <w:r>
+        <w:t>razredu</w:t>
+      </w:r>
+      <w:proofErr w:type="spellEnd"/>
+      <w:r>
+        <w:t xml:space="preserve"> in 7–9 9. </w:t>
+      </w:r>
+      <w:proofErr w:type="spellStart"/>
+      <w:r>
+        <w:t>razredu</w:t>
+      </w:r>
+      <w:proofErr w:type="spellEnd"/>
+      <w:r>
+        <w:t xml:space="preserve">. </w:t>
+      </w:r>
+      <w:proofErr w:type="spellStart"/>
+      <w:r>
+        <w:t>Znotraj</w:t>
+      </w:r>
+      <w:proofErr w:type="spellEnd"/>
+      <w:r>
+        <w:t xml:space="preserve"> </w:t>
+      </w:r>
+      <w:proofErr w:type="spellStart"/>
+      <w:r>
+        <w:t>vsakega</w:t>
+      </w:r>
+      <w:proofErr w:type="spellEnd"/>
+      <w:r>
+        <w:t xml:space="preserve"> </w:t>
+      </w:r>
+      <w:proofErr w:type="spellStart"/>
+      <w:r>
+        <w:t>razreda</w:t>
+      </w:r>
+      <w:proofErr w:type="spellEnd"/>
+      <w:r>
+        <w:t xml:space="preserve"> so tri </w:t>
+      </w:r>
+      <w:proofErr w:type="spellStart"/>
+      <w:r>
+        <w:t>notranje</w:t>
+      </w:r>
+      <w:proofErr w:type="spellEnd"/>
+      <w:r>
+        <w:t xml:space="preserve"> </w:t>
+      </w:r>
+      <w:proofErr w:type="spellStart"/>
+      <w:r>
+        <w:t>stopnje</w:t>
+      </w:r>
+      <w:proofErr w:type="spellEnd"/>
+      <w:r>
+        <w:t xml:space="preserve">, ki </w:t>
+      </w:r>
+      <w:proofErr w:type="spellStart"/>
+      <w:r>
+        <w:t>vplivajo</w:t>
+      </w:r>
+      <w:proofErr w:type="spellEnd"/>
+      <w:r>
+        <w:t xml:space="preserve"> </w:t>
+      </w:r>
+      <w:proofErr w:type="spellStart"/>
+      <w:r>
+        <w:t>na</w:t>
+      </w:r>
+      <w:proofErr w:type="spellEnd"/>
+      <w:r>
+        <w:t xml:space="preserve"> </w:t>
+      </w:r>
+      <w:proofErr w:type="spellStart"/>
+      <w:r>
+        <w:t>velikost</w:t>
+      </w:r>
+      <w:proofErr w:type="spellEnd"/>
+      <w:r>
+        <w:t xml:space="preserve"> </w:t>
+      </w:r>
+      <w:proofErr w:type="spellStart"/>
+      <w:r>
+        <w:t>števil</w:t>
+      </w:r>
+      <w:proofErr w:type="spellEnd"/>
+      <w:r>
+        <w:t xml:space="preserve">, </w:t>
+      </w:r>
+      <w:proofErr w:type="spellStart"/>
+      <w:r>
+        <w:t>faktorjev</w:t>
+      </w:r>
+      <w:proofErr w:type="spellEnd"/>
+      <w:r>
+        <w:t xml:space="preserve">, </w:t>
+      </w:r>
+      <w:proofErr w:type="spellStart"/>
+      <w:r>
+        <w:t>imenovalcev</w:t>
+      </w:r>
+      <w:proofErr w:type="spellEnd"/>
+      <w:r>
+        <w:t xml:space="preserve"> in </w:t>
+      </w:r>
+      <w:proofErr w:type="spellStart"/>
+      <w:r>
+        <w:t>koeficientov</w:t>
+      </w:r>
+      <w:proofErr w:type="spellEnd"/>
+      <w:r>
+        <w:t xml:space="preserve">. Pri </w:t>
+      </w:r>
+      <w:proofErr w:type="spellStart"/>
+      <w:r>
+        <w:t>generiranju</w:t>
+      </w:r>
+      <w:proofErr w:type="spellEnd"/>
+      <w:r>
+        <w:t xml:space="preserve"> </w:t>
+      </w:r>
+      <w:proofErr w:type="spellStart"/>
+      <w:r>
+        <w:t>sem</w:t>
+      </w:r>
+      <w:proofErr w:type="spellEnd"/>
+      <w:r>
+        <w:t xml:space="preserve"> </w:t>
+      </w:r>
+      <w:proofErr w:type="spellStart"/>
+      <w:r>
+        <w:t>uporabil</w:t>
+      </w:r>
+      <w:proofErr w:type="spellEnd"/>
+      <w:r>
+        <w:t xml:space="preserve"> </w:t>
+      </w:r>
+      <w:proofErr w:type="spellStart"/>
+      <w:r>
+        <w:t>tudi</w:t>
+      </w:r>
+      <w:proofErr w:type="spellEnd"/>
+      <w:r>
+        <w:t xml:space="preserve"> </w:t>
+      </w:r>
+      <w:proofErr w:type="spellStart"/>
+      <w:r>
+        <w:t>Pitagorove</w:t>
+      </w:r>
+      <w:proofErr w:type="spellEnd"/>
+      <w:r>
+        <w:t xml:space="preserve"> </w:t>
+      </w:r>
+      <w:proofErr w:type="spellStart"/>
+      <w:r>
+        <w:t>trojice</w:t>
+      </w:r>
+      <w:proofErr w:type="spellEnd"/>
+      <w:r>
+        <w:t xml:space="preserve"> in </w:t>
+      </w:r>
+      <w:proofErr w:type="spellStart"/>
+      <w:r>
+        <w:t>popolne</w:t>
+      </w:r>
+      <w:proofErr w:type="spellEnd"/>
+      <w:r>
+        <w:t xml:space="preserve"> </w:t>
+      </w:r>
+      <w:proofErr w:type="spellStart"/>
+      <w:r>
+        <w:t>kvadrate</w:t>
+      </w:r>
+      <w:proofErr w:type="spellEnd"/>
+      <w:r>
+        <w:t xml:space="preserve">, da so </w:t>
+      </w:r>
+      <w:proofErr w:type="spellStart"/>
+      <w:r>
+        <w:t>rezultati</w:t>
+      </w:r>
+      <w:proofErr w:type="spellEnd"/>
+      <w:r>
+        <w:t xml:space="preserve"> </w:t>
+      </w:r>
+      <w:proofErr w:type="spellStart"/>
+      <w:r>
+        <w:t>enostavni</w:t>
+      </w:r>
+      <w:proofErr w:type="spellEnd"/>
+      <w:r>
+        <w:t xml:space="preserve"> in </w:t>
+      </w:r>
+      <w:proofErr w:type="spellStart"/>
+      <w:r>
+        <w:t>večinoma</w:t>
+      </w:r>
+      <w:proofErr w:type="spellEnd"/>
+      <w:r>
+        <w:t xml:space="preserve"> </w:t>
+      </w:r>
+      <w:proofErr w:type="spellStart"/>
+      <w:r>
+        <w:t>celoštevilski</w:t>
+      </w:r>
+      <w:proofErr w:type="spellEnd"/>
+      <w:r>
+        <w:t>.</w:t>
+      </w:r>
+    </w:p>
+    <w:p>
+      <w:r>
+        <w:t xml:space="preserve">Za </w:t>
+      </w:r>
+      <w:proofErr w:type="spellStart"/>
+      <w:r>
+        <w:t>vsako</w:t>
+      </w:r>
+      <w:proofErr w:type="spellEnd"/>
+      <w:r>
+        <w:t xml:space="preserve"> </w:t>
+      </w:r>
+      <w:proofErr w:type="spellStart"/>
+      <w:r>
+        <w:t>vprašanje</w:t>
+      </w:r>
+      <w:proofErr w:type="spellEnd"/>
+      <w:r>
+        <w:t xml:space="preserve"> se </w:t>
+      </w:r>
+      <w:proofErr w:type="spellStart"/>
+      <w:r>
+        <w:t>naključno</w:t>
+      </w:r>
+      <w:proofErr w:type="spellEnd"/>
+      <w:r>
+        <w:t xml:space="preserve"> </w:t>
+      </w:r>
+      <w:proofErr w:type="spellStart"/>
+      <w:r>
+        <w:t>izbere</w:t>
+      </w:r>
+      <w:proofErr w:type="spellEnd"/>
+      <w:r>
+        <w:t xml:space="preserve"> </w:t>
+      </w:r>
+      <w:proofErr w:type="spellStart"/>
+      <w:r>
+        <w:t>področje</w:t>
+      </w:r>
+      <w:proofErr w:type="spellEnd"/>
+      <w:r>
+        <w:t xml:space="preserve">, </w:t>
+      </w:r>
+      <w:proofErr w:type="spellStart"/>
+      <w:r>
+        <w:t>nato</w:t>
+      </w:r>
+      <w:proofErr w:type="spellEnd"/>
+      <w:r>
+        <w:t xml:space="preserve"> pa generator </w:t>
+      </w:r>
+      <w:proofErr w:type="spellStart"/>
+      <w:r>
+        <w:t>naključno</w:t>
+      </w:r>
+      <w:proofErr w:type="spellEnd"/>
+      <w:r>
+        <w:t xml:space="preserve"> </w:t>
+      </w:r>
+      <w:proofErr w:type="spellStart"/>
+      <w:r>
+        <w:t>določi</w:t>
+      </w:r>
+      <w:proofErr w:type="spellEnd"/>
+      <w:r>
+        <w:t xml:space="preserve"> </w:t>
+      </w:r>
+      <w:proofErr w:type="spellStart"/>
+      <w:r>
+        <w:t>konkretne</w:t>
+      </w:r>
+      <w:proofErr w:type="spellEnd"/>
+      <w:r>
+        <w:t xml:space="preserve"> </w:t>
+      </w:r>
+      <w:proofErr w:type="spellStart"/>
+      <w:r>
+        <w:t>podatke</w:t>
+      </w:r>
+      <w:proofErr w:type="spellEnd"/>
+      <w:r>
+        <w:t xml:space="preserve">. </w:t>
+      </w:r>
+      <w:proofErr w:type="spellStart"/>
+      <w:r>
+        <w:t>Zato</w:t>
+      </w:r>
+      <w:proofErr w:type="spellEnd"/>
+      <w:r>
+        <w:t xml:space="preserve"> se </w:t>
+      </w:r>
+      <w:proofErr w:type="spellStart"/>
+      <w:r>
+        <w:t>lahko</w:t>
+      </w:r>
+      <w:proofErr w:type="spellEnd"/>
+      <w:r>
+        <w:t xml:space="preserve"> </w:t>
+      </w:r>
+      <w:proofErr w:type="spellStart"/>
+      <w:r>
+        <w:t>isto</w:t>
+      </w:r>
+      <w:proofErr w:type="spellEnd"/>
+      <w:r>
+        <w:t xml:space="preserve"> </w:t>
+      </w:r>
+      <w:proofErr w:type="spellStart"/>
+      <w:r>
+        <w:t>področje</w:t>
+      </w:r>
+      <w:proofErr w:type="spellEnd"/>
+      <w:r>
+        <w:t xml:space="preserve"> </w:t>
+      </w:r>
+      <w:proofErr w:type="spellStart"/>
+      <w:r>
+        <w:t>pojavi</w:t>
+      </w:r>
+      <w:proofErr w:type="spellEnd"/>
+      <w:r>
+        <w:t xml:space="preserve"> </w:t>
+      </w:r>
+      <w:proofErr w:type="spellStart"/>
+      <w:r>
+        <w:t>večkrat</w:t>
+      </w:r>
+      <w:proofErr w:type="spellEnd"/>
+      <w:r>
+        <w:t xml:space="preserve">, </w:t>
+      </w:r>
+      <w:proofErr w:type="spellStart"/>
+      <w:r>
+        <w:t>vsa</w:t>
+      </w:r>
+      <w:proofErr w:type="spellEnd"/>
+      <w:r>
+        <w:t xml:space="preserve"> </w:t>
+      </w:r>
+      <w:proofErr w:type="spellStart"/>
+      <w:r>
+        <w:t>področja</w:t>
+      </w:r>
+      <w:proofErr w:type="spellEnd"/>
+      <w:r>
+        <w:t xml:space="preserve"> pa </w:t>
+      </w:r>
+      <w:proofErr w:type="spellStart"/>
+      <w:r>
+        <w:t>nimajo</w:t>
+      </w:r>
+      <w:proofErr w:type="spellEnd"/>
+      <w:r>
+        <w:t xml:space="preserve"> </w:t>
+      </w:r>
+      <w:proofErr w:type="spellStart"/>
+      <w:r>
+        <w:t>nujno</w:t>
+      </w:r>
+      <w:proofErr w:type="spellEnd"/>
+      <w:r>
+        <w:t xml:space="preserve"> </w:t>
+      </w:r>
+      <w:proofErr w:type="spellStart"/>
+      <w:r>
+        <w:t>enake</w:t>
+      </w:r>
+      <w:proofErr w:type="spellEnd"/>
+      <w:r>
+        <w:t xml:space="preserve"> </w:t>
+      </w:r>
+      <w:proofErr w:type="spellStart"/>
+      <w:r>
+        <w:t>zastopanosti</w:t>
+      </w:r>
+      <w:proofErr w:type="spellEnd"/>
+      <w:r>
+        <w:t xml:space="preserve"> v </w:t>
+      </w:r>
+      <w:proofErr w:type="spellStart"/>
+      <w:r>
+        <w:t>kratkem</w:t>
+      </w:r>
+      <w:proofErr w:type="spellEnd"/>
+      <w:r>
+        <w:t xml:space="preserve"> </w:t>
+      </w:r>
+      <w:proofErr w:type="spellStart"/>
+      <w:r>
+        <w:t>kvizu</w:t>
+      </w:r>
+      <w:proofErr w:type="spellEnd"/>
+      <w:r>
+        <w:t xml:space="preserve">. </w:t>
+      </w:r>
+      <w:proofErr w:type="spellStart"/>
+      <w:r>
+        <w:t>Dodal</w:t>
+      </w:r>
+      <w:proofErr w:type="spellEnd"/>
+      <w:r>
+        <w:t xml:space="preserve"> </w:t>
+      </w:r>
+      <w:proofErr w:type="spellStart"/>
+      <w:r>
+        <w:t>sem</w:t>
+      </w:r>
+      <w:proofErr w:type="spellEnd"/>
+      <w:r>
+        <w:t xml:space="preserve"> </w:t>
+      </w:r>
+      <w:proofErr w:type="spellStart"/>
+      <w:r>
+        <w:t>tudi</w:t>
+      </w:r>
+      <w:proofErr w:type="spellEnd"/>
+      <w:r>
+        <w:t xml:space="preserve"> </w:t>
+      </w:r>
+      <w:proofErr w:type="spellStart"/>
+      <w:r>
+        <w:t>fiksni</w:t>
+      </w:r>
+      <w:proofErr w:type="spellEnd"/>
+      <w:r>
+        <w:t xml:space="preserve"> in </w:t>
+      </w:r>
+      <w:proofErr w:type="spellStart"/>
+      <w:r>
+        <w:t>progresivni</w:t>
+      </w:r>
+      <w:proofErr w:type="spellEnd"/>
+      <w:r>
+        <w:t xml:space="preserve"> </w:t>
+      </w:r>
+      <w:proofErr w:type="spellStart"/>
+      <w:r>
+        <w:t>način</w:t>
+      </w:r>
+      <w:proofErr w:type="spellEnd"/>
+      <w:r>
+        <w:t xml:space="preserve">. </w:t>
+      </w:r>
+      <w:proofErr w:type="spellStart"/>
+      <w:r>
+        <w:t>Fiksni</w:t>
+      </w:r>
+      <w:proofErr w:type="spellEnd"/>
+      <w:r>
+        <w:t xml:space="preserve"> </w:t>
+      </w:r>
+      <w:proofErr w:type="spellStart"/>
+      <w:r>
+        <w:t>način</w:t>
+      </w:r>
+      <w:proofErr w:type="spellEnd"/>
+      <w:r>
+        <w:t xml:space="preserve"> </w:t>
+      </w:r>
+      <w:proofErr w:type="spellStart"/>
+      <w:r>
+        <w:t>uporablja</w:t>
+      </w:r>
+      <w:proofErr w:type="spellEnd"/>
+      <w:r>
+        <w:t xml:space="preserve"> </w:t>
+      </w:r>
+      <w:proofErr w:type="spellStart"/>
+      <w:r>
+        <w:t>samo</w:t>
+      </w:r>
+      <w:proofErr w:type="spellEnd"/>
+      <w:r>
+        <w:t xml:space="preserve"> </w:t>
+      </w:r>
+      <w:proofErr w:type="spellStart"/>
+      <w:r>
+        <w:t>izbrani</w:t>
+      </w:r>
+      <w:proofErr w:type="spellEnd"/>
+      <w:r>
+        <w:t xml:space="preserve"> </w:t>
+      </w:r>
+      <w:proofErr w:type="spellStart"/>
+      <w:r>
+        <w:t>razred</w:t>
+      </w:r>
+      <w:proofErr w:type="spellEnd"/>
+      <w:r>
+        <w:t xml:space="preserve">, </w:t>
+      </w:r>
+      <w:proofErr w:type="spellStart"/>
+      <w:r>
+        <w:t>progresivni</w:t>
+      </w:r>
+      <w:proofErr w:type="spellEnd"/>
+      <w:r>
+        <w:t xml:space="preserve"> pa </w:t>
+      </w:r>
+      <w:proofErr w:type="spellStart"/>
+      <w:r>
+        <w:t>vključi</w:t>
+      </w:r>
+      <w:proofErr w:type="spellEnd"/>
+      <w:r>
+        <w:t xml:space="preserve"> </w:t>
+      </w:r>
+      <w:proofErr w:type="spellStart"/>
+      <w:r>
+        <w:t>tudi</w:t>
+      </w:r>
+      <w:proofErr w:type="spellEnd"/>
+      <w:r>
+        <w:t xml:space="preserve"> </w:t>
+      </w:r>
+      <w:proofErr w:type="spellStart"/>
+      <w:r>
+        <w:t>vse</w:t>
+      </w:r>
+      <w:proofErr w:type="spellEnd"/>
+      <w:r>
+        <w:t xml:space="preserve"> </w:t>
+      </w:r>
+      <w:proofErr w:type="spellStart"/>
+      <w:r>
+        <w:t>predhodne</w:t>
+      </w:r>
+      <w:proofErr w:type="spellEnd"/>
+      <w:r>
+        <w:t xml:space="preserve"> </w:t>
+      </w:r>
+      <w:proofErr w:type="spellStart"/>
+      <w:r>
+        <w:t>razrede</w:t>
+      </w:r>
+      <w:proofErr w:type="spellEnd"/>
+      <w:r>
+        <w:t>. V API-</w:t>
+      </w:r>
+      <w:proofErr w:type="spellStart"/>
+      <w:r>
+        <w:t>ruto</w:t>
+      </w:r>
+      <w:proofErr w:type="spellEnd"/>
+      <w:r>
+        <w:t xml:space="preserve"> </w:t>
+      </w:r>
+      <w:proofErr w:type="spellStart"/>
+      <w:r>
+        <w:t>sem</w:t>
+      </w:r>
+      <w:proofErr w:type="spellEnd"/>
+      <w:r>
+        <w:t xml:space="preserve"> </w:t>
+      </w:r>
+      <w:proofErr w:type="spellStart"/>
+      <w:r>
+        <w:t>dodal</w:t>
+      </w:r>
+      <w:proofErr w:type="spellEnd"/>
+      <w:r>
+        <w:t xml:space="preserve"> </w:t>
+      </w:r>
+      <w:proofErr w:type="spellStart"/>
+      <w:r>
+        <w:t>možnost</w:t>
+      </w:r>
+      <w:proofErr w:type="spellEnd"/>
+      <w:r>
+        <w:t xml:space="preserve"> </w:t>
+      </w:r>
+      <w:proofErr w:type="spellStart"/>
+      <w:r>
+        <w:t>izbire</w:t>
+      </w:r>
+      <w:proofErr w:type="spellEnd"/>
+      <w:r>
+        <w:t xml:space="preserve"> </w:t>
+      </w:r>
+      <w:proofErr w:type="spellStart"/>
+      <w:r>
+        <w:t>tega</w:t>
+      </w:r>
+      <w:proofErr w:type="spellEnd"/>
+      <w:r>
+        <w:t xml:space="preserve"> </w:t>
+      </w:r>
+      <w:proofErr w:type="spellStart"/>
+      <w:r>
+        <w:t>načina</w:t>
+      </w:r>
+      <w:proofErr w:type="spellEnd"/>
+      <w:r>
+        <w:t xml:space="preserve">. Čas </w:t>
+      </w:r>
+      <w:proofErr w:type="spellStart"/>
+      <w:r>
+        <w:t>reševanja</w:t>
+      </w:r>
+      <w:proofErr w:type="spellEnd"/>
+      <w:r>
+        <w:t xml:space="preserve"> je </w:t>
+      </w:r>
+      <w:proofErr w:type="spellStart"/>
+      <w:r>
+        <w:t>odvisen</w:t>
+      </w:r>
+      <w:proofErr w:type="spellEnd"/>
+      <w:r>
+        <w:t xml:space="preserve"> od </w:t>
+      </w:r>
+      <w:proofErr w:type="spellStart"/>
+      <w:r>
+        <w:t>notranje</w:t>
+      </w:r>
+      <w:proofErr w:type="spellEnd"/>
+      <w:r>
+        <w:t xml:space="preserve"> </w:t>
+      </w:r>
+      <w:proofErr w:type="spellStart"/>
+      <w:r>
+        <w:t>stopnje</w:t>
+      </w:r>
+      <w:proofErr w:type="spellEnd"/>
+      <w:r>
+        <w:t xml:space="preserve"> in </w:t>
+      </w:r>
+      <w:proofErr w:type="spellStart"/>
+      <w:r>
+        <w:t>znaša</w:t>
+      </w:r>
+      <w:proofErr w:type="spellEnd"/>
+      <w:r>
+        <w:t xml:space="preserve"> 45, 30 </w:t>
+      </w:r>
+      <w:proofErr w:type="spellStart"/>
+      <w:r>
+        <w:t>ali</w:t>
+      </w:r>
+      <w:proofErr w:type="spellEnd"/>
+      <w:r>
+        <w:t xml:space="preserve"> 20 </w:t>
+      </w:r>
+      <w:proofErr w:type="spellStart"/>
+      <w:r>
+        <w:t>sekund</w:t>
+      </w:r>
+      <w:proofErr w:type="spellEnd"/>
+      <w:r>
+        <w:t xml:space="preserve">. </w:t>
+      </w:r>
+      <w:proofErr w:type="spellStart"/>
+      <w:r>
+        <w:t>Verjetno</w:t>
+      </w:r>
+      <w:proofErr w:type="spellEnd"/>
+      <w:r>
+        <w:t xml:space="preserve"> </w:t>
+      </w:r>
+      <w:proofErr w:type="spellStart"/>
+      <w:r>
+        <w:t>bom</w:t>
+      </w:r>
+      <w:proofErr w:type="spellEnd"/>
+      <w:r>
+        <w:t xml:space="preserve"> </w:t>
+      </w:r>
+      <w:proofErr w:type="spellStart"/>
+      <w:r>
+        <w:t>delovanje</w:t>
+      </w:r>
+      <w:proofErr w:type="spellEnd"/>
+      <w:r>
+        <w:t xml:space="preserve"> </w:t>
+      </w:r>
+      <w:proofErr w:type="spellStart"/>
+      <w:r>
+        <w:t>teh</w:t>
+      </w:r>
+      <w:proofErr w:type="spellEnd"/>
+      <w:r>
+        <w:t xml:space="preserve"> </w:t>
+      </w:r>
+      <w:proofErr w:type="spellStart"/>
+      <w:r>
+        <w:t>dveh</w:t>
+      </w:r>
+      <w:proofErr w:type="spellEnd"/>
+      <w:r>
+        <w:t xml:space="preserve"> </w:t>
+      </w:r>
+      <w:proofErr w:type="spellStart"/>
+      <w:r>
+        <w:t>načinov</w:t>
+      </w:r>
+      <w:proofErr w:type="spellEnd"/>
+      <w:r>
+        <w:t xml:space="preserve"> </w:t>
+      </w:r>
+      <w:proofErr w:type="spellStart"/>
+      <w:r>
+        <w:t>še</w:t>
+      </w:r>
+      <w:proofErr w:type="spellEnd"/>
+      <w:r>
+        <w:t xml:space="preserve"> </w:t>
+      </w:r>
+      <w:proofErr w:type="spellStart"/>
+      <w:r>
+        <w:t>spremenil</w:t>
+      </w:r>
+      <w:proofErr w:type="spellEnd"/>
+      <w:r>
+        <w:t>.</w:t>
+      </w:r>
+    </w:p>
+    <w:p>
+      <w:proofErr w:type="spellStart"/>
+      <w:r>
         <w:t>Glavna</w:t>
       </w:r>
       <w:proofErr w:type="spellEnd"/>
@@ -9344,6 +9608,30 @@
       <w:u w:val="single"/>
     </w:rPr>
   </w:style>
+  <w:style w:type="character" w:styleId="UnresolvedMention">
+    <w:name w:val="Unresolved Mention"/>
+    <w:basedOn w:val="DefaultParagraphFont"/>
+    <w:uiPriority w:val="99"/>
+    <w:semiHidden/>
+    <w:unhideWhenUsed/>
+    <w:rsid w:val="00700726"/>
+    <w:rPr>
+      <w:color w:val="605E5C"/>
+      <w:shd w:val="clear" w:color="auto" w:fill="E1DFDD"/>
+    </w:rPr>
+  </w:style>
+  <w:style w:type="character" w:styleId="FollowedHyperlink">
+    <w:name w:val="FollowedHyperlink"/>
+    <w:basedOn w:val="DefaultParagraphFont"/>
+    <w:uiPriority w:val="99"/>
+    <w:semiHidden/>
+    <w:unhideWhenUsed/>
+    <w:rsid w:val="00700726"/>
+    <w:rPr>
+      <w:color w:val="96607D" w:themeColor="followedHyperlink"/>
+      <w:u w:val="single"/>
+    </w:rPr>
+  </w:style>
 </w:styles>
 </file>
 

</xml_diff>